<commit_message>
Add remaining MC script sections
Co-Authored-By: Claude Sonnet 5.5 <noreply@anthropic.com>
Claude-Session: https://claude.ai/code/session_01UdK4F1Z4Jg3Yw7GwzFQFXX
</commit_message>
<xml_diff>
--- a/사회자_대본.docx
+++ b/사회자_대본.docx
@@ -59,8 +59,8 @@
             <w:r>
               <w:rPr>
                 <w:rFonts w:ascii="바탕" w:cs="바탕" w:eastAsia="바탕" w:hAnsi="바탕"/>
-                <w:b w:val="false"/>
-                <w:bCs w:val="false"/>
+                <w:b/>
+                <w:bCs/>
                 <w:sz w:val="24"/>
                 <w:szCs w:val="24"/>
               </w:rPr>
@@ -75,8 +75,8 @@
             <w:r>
               <w:rPr>
                 <w:rFonts w:ascii="바탕" w:cs="바탕" w:eastAsia="바탕" w:hAnsi="바탕"/>
-                <w:b w:val="false"/>
-                <w:bCs w:val="false"/>
+                <w:b/>
+                <w:bCs/>
                 <w:sz w:val="24"/>
                 <w:szCs w:val="24"/>
               </w:rPr>
@@ -179,17 +179,22 @@
               <w:bottom w:type="dxa" w:w="80"/>
               <w:right w:type="dxa" w:w="120"/>
             </w:tcMar>
+            <w:vAlign w:val="center"/>
           </w:tcPr>
           <w:p>
-            <w:r>
-              <w:rPr>
-                <w:rFonts w:ascii="바탕" w:cs="바탕" w:eastAsia="바탕" w:hAnsi="바탕"/>
-                <w:b w:val="false"/>
-                <w:bCs w:val="false"/>
-                <w:sz w:val="24"/>
-                <w:szCs w:val="24"/>
-              </w:rPr>
-              <w:t xml:space="preserve"/>
+            <w:pPr>
+              <w:spacing w:line="360"/>
+              <w:jc w:val="center"/>
+            </w:pPr>
+            <w:r>
+              <w:rPr>
+                <w:rFonts w:ascii="바탕" w:cs="바탕" w:eastAsia="바탕" w:hAnsi="바탕"/>
+                <w:b/>
+                <w:bCs/>
+                <w:sz w:val="24"/>
+                <w:szCs w:val="24"/>
+              </w:rPr>
+              <w:t xml:space="preserve">개식사</w:t>
             </w:r>
           </w:p>
         </w:tc>
@@ -241,6 +246,9 @@
             </w:r>
           </w:p>
           <w:p>
+            <w:pPr>
+              <w:spacing w:line="360"/>
+            </w:pPr>
             <w:r>
               <w:rPr>
                 <w:rFonts w:ascii="바탕" w:cs="바탕" w:eastAsia="바탕" w:hAnsi="바탕"/>
@@ -301,6 +309,9 @@
             </w:r>
           </w:p>
           <w:p>
+            <w:pPr>
+              <w:spacing w:line="360"/>
+            </w:pPr>
             <w:r>
               <w:rPr>
                 <w:rFonts w:ascii="바탕" w:cs="바탕" w:eastAsia="바탕" w:hAnsi="바탕"/>
@@ -374,6 +385,1670 @@
                 <w:szCs w:val="24"/>
               </w:rPr>
               <w:t xml:space="preserve">이 결혼식을 풍성히 채워주시면 감사하겠습니다.</w:t>
+            </w:r>
+          </w:p>
+          <w:p>
+            <w:pPr>
+              <w:spacing w:line="360"/>
+            </w:pPr>
+            <w:r>
+              <w:rPr>
+                <w:rFonts w:ascii="바탕" w:cs="바탕" w:eastAsia="바탕" w:hAnsi="바탕"/>
+                <w:b w:val="false"/>
+                <w:bCs w:val="false"/>
+                <w:sz w:val="24"/>
+                <w:szCs w:val="24"/>
+              </w:rPr>
+              <w:t xml:space="preserve"/>
+            </w:r>
+          </w:p>
+          <w:p>
+            <w:pPr>
+              <w:spacing w:line="360"/>
+            </w:pPr>
+            <w:r>
+              <w:rPr>
+                <w:rFonts w:ascii="바탕" w:cs="바탕" w:eastAsia="바탕" w:hAnsi="바탕"/>
+                <w:b w:val="false"/>
+                <w:bCs w:val="false"/>
+                <w:color w:val="0000FF"/>
+                <w:sz w:val="24"/>
+                <w:szCs w:val="24"/>
+              </w:rPr>
+              <w:t xml:space="preserve">또한, 저희 두사람이 부부가 되는 즐겁고 화목한 가족 예식의 사회를</w:t>
+            </w:r>
+          </w:p>
+          <w:p>
+            <w:pPr>
+              <w:spacing w:line="360"/>
+            </w:pPr>
+            <w:r>
+              <w:rPr>
+                <w:rFonts w:ascii="바탕" w:cs="바탕" w:eastAsia="바탕" w:hAnsi="바탕"/>
+                <w:b w:val="false"/>
+                <w:bCs w:val="false"/>
+                <w:color w:val="0000FF"/>
+                <w:sz w:val="24"/>
+                <w:szCs w:val="24"/>
+              </w:rPr>
+              <w:t xml:space="preserve">좀 더 자유로운 분위기에서 직접 진행하는 만큼,</w:t>
+            </w:r>
+          </w:p>
+          <w:p>
+            <w:pPr>
+              <w:spacing w:line="360"/>
+            </w:pPr>
+            <w:r>
+              <w:rPr>
+                <w:rFonts w:ascii="바탕" w:cs="바탕" w:eastAsia="바탕" w:hAnsi="바탕"/>
+                <w:b w:val="false"/>
+                <w:bCs w:val="false"/>
+                <w:color w:val="0000FF"/>
+                <w:sz w:val="24"/>
+                <w:szCs w:val="24"/>
+              </w:rPr>
+              <w:t xml:space="preserve">미흡한 점이 있어도 예쁘게 봐주시고</w:t>
+            </w:r>
+          </w:p>
+          <w:p>
+            <w:pPr>
+              <w:spacing w:line="360"/>
+            </w:pPr>
+            <w:r>
+              <w:rPr>
+                <w:rFonts w:ascii="바탕" w:cs="바탕" w:eastAsia="바탕" w:hAnsi="바탕"/>
+                <w:b w:val="false"/>
+                <w:bCs w:val="false"/>
+                <w:color w:val="0000FF"/>
+                <w:sz w:val="24"/>
+                <w:szCs w:val="24"/>
+              </w:rPr>
+              <w:t xml:space="preserve">편안한 마음으로 예식을 즐겨주시면 좋겠습니다.</w:t>
+            </w:r>
+          </w:p>
+          <w:p>
+            <w:pPr>
+              <w:spacing w:line="360"/>
+            </w:pPr>
+            <w:r>
+              <w:rPr>
+                <w:rFonts w:ascii="바탕" w:cs="바탕" w:eastAsia="바탕" w:hAnsi="바탕"/>
+                <w:b w:val="false"/>
+                <w:bCs w:val="false"/>
+                <w:color w:val="0000FF"/>
+                <w:sz w:val="24"/>
+                <w:szCs w:val="24"/>
+              </w:rPr>
+              <w:t xml:space="preserve">가족 결혼식인 만큼, 여기 계신 가족 분들께서 사랑의 증인으로</w:t>
+            </w:r>
+          </w:p>
+          <w:p>
+            <w:pPr>
+              <w:spacing w:line="360"/>
+            </w:pPr>
+            <w:r>
+              <w:rPr>
+                <w:rFonts w:ascii="바탕" w:cs="바탕" w:eastAsia="바탕" w:hAnsi="바탕"/>
+                <w:b w:val="false"/>
+                <w:bCs w:val="false"/>
+                <w:color w:val="0000FF"/>
+                <w:sz w:val="24"/>
+                <w:szCs w:val="24"/>
+              </w:rPr>
+              <w:t xml:space="preserve">더 큰 마음으로 함께 해주시기를 부탁드립니다.</w:t>
+            </w:r>
+          </w:p>
+          <w:p>
+            <w:pPr>
+              <w:spacing w:line="360"/>
+            </w:pPr>
+            <w:r>
+              <w:rPr>
+                <w:rFonts w:ascii="바탕" w:cs="바탕" w:eastAsia="바탕" w:hAnsi="바탕"/>
+                <w:b/>
+                <w:bCs/>
+                <w:sz w:val="24"/>
+                <w:szCs w:val="24"/>
+              </w:rPr>
+              <w:t xml:space="preserve"> (사회자 모두 고개 숙여 인사드리기)</w:t>
+            </w:r>
+          </w:p>
+          <w:p>
+            <w:pPr>
+              <w:spacing w:line="360"/>
+            </w:pPr>
+            <w:r>
+              <w:rPr>
+                <w:rFonts w:ascii="바탕" w:cs="바탕" w:eastAsia="바탕" w:hAnsi="바탕"/>
+                <w:b w:val="false"/>
+                <w:bCs w:val="false"/>
+                <w:sz w:val="24"/>
+                <w:szCs w:val="24"/>
+              </w:rPr>
+              <w:t xml:space="preserve"/>
+            </w:r>
+          </w:p>
+          <w:p>
+            <w:pPr>
+              <w:spacing w:line="360"/>
+            </w:pPr>
+            <w:r>
+              <w:rPr>
+                <w:rFonts w:ascii="바탕" w:cs="바탕" w:eastAsia="바탕" w:hAnsi="바탕"/>
+                <w:b w:val="false"/>
+                <w:bCs w:val="false"/>
+                <w:color w:val="0000FF"/>
+                <w:sz w:val="24"/>
+                <w:szCs w:val="24"/>
+              </w:rPr>
+              <w:t xml:space="preserve">제가 시작하겠습니다- 하면 큰 박수와 환호성으로 저희를 축복해주시면</w:t>
+            </w:r>
+          </w:p>
+          <w:p>
+            <w:pPr>
+              <w:spacing w:line="360"/>
+            </w:pPr>
+            <w:r>
+              <w:rPr>
+                <w:rFonts w:ascii="바탕" w:cs="바탕" w:eastAsia="바탕" w:hAnsi="바탕"/>
+                <w:b w:val="false"/>
+                <w:bCs w:val="false"/>
+                <w:color w:val="0000FF"/>
+                <w:sz w:val="24"/>
+                <w:szCs w:val="24"/>
+              </w:rPr>
+              <w:t xml:space="preserve">감사하겠습니다. 지금부터 작지만 매우 아름다운 결혼식을 큰 박수와 환호로</w:t>
+            </w:r>
+          </w:p>
+          <w:p>
+            <w:pPr>
+              <w:spacing w:line="360"/>
+            </w:pPr>
+            <w:r>
+              <w:rPr>
+                <w:rFonts w:ascii="바탕" w:cs="바탕" w:eastAsia="바탕" w:hAnsi="바탕"/>
+                <w:b w:val="false"/>
+                <w:bCs w:val="false"/>
+                <w:color w:val="0000FF"/>
+                <w:sz w:val="24"/>
+                <w:szCs w:val="24"/>
+              </w:rPr>
+              <w:t xml:space="preserve">시작하겠습니다!</w:t>
+            </w:r>
+          </w:p>
+          <w:p>
+            <w:pPr>
+              <w:spacing w:line="360"/>
+            </w:pPr>
+            <w:r>
+              <w:rPr>
+                <w:rFonts w:ascii="바탕" w:cs="바탕" w:eastAsia="바탕" w:hAnsi="바탕"/>
+                <w:b w:val="false"/>
+                <w:bCs w:val="false"/>
+                <w:sz w:val="24"/>
+                <w:szCs w:val="24"/>
+              </w:rPr>
+              <w:t xml:space="preserve"/>
+            </w:r>
+          </w:p>
+          <w:p>
+            <w:pPr>
+              <w:spacing w:line="360"/>
+            </w:pPr>
+            <w:r>
+              <w:rPr>
+                <w:rFonts w:ascii="바탕" w:cs="바탕" w:eastAsia="바탕" w:hAnsi="바탕"/>
+                <w:b w:val="false"/>
+                <w:bCs w:val="false"/>
+                <w:color w:val="FF0000"/>
+                <w:sz w:val="24"/>
+                <w:szCs w:val="24"/>
+              </w:rPr>
+              <w:t xml:space="preserve">- 1번 bgm끝</w:t>
+            </w:r>
+          </w:p>
+        </w:tc>
+      </w:tr>
+      <w:tr>
+        <w:tc>
+          <w:tcPr>
+            <w:tcW w:type="dxa" w:w="2400"/>
+            <w:tcBorders>
+              <w:top w:val="single" w:color="000000" w:sz="6"/>
+              <w:left w:val="single" w:color="000000" w:sz="6"/>
+              <w:bottom w:val="single" w:color="000000" w:sz="6"/>
+              <w:right w:val="single" w:color="000000" w:sz="6"/>
+            </w:tcBorders>
+            <w:tcMar>
+              <w:top w:type="dxa" w:w="80"/>
+              <w:left w:type="dxa" w:w="120"/>
+              <w:bottom w:type="dxa" w:w="80"/>
+              <w:right w:type="dxa" w:w="120"/>
+            </w:tcMar>
+            <w:vAlign w:val="center"/>
+          </w:tcPr>
+          <w:p>
+            <w:pPr>
+              <w:spacing w:line="360"/>
+              <w:jc w:val="center"/>
+            </w:pPr>
+            <w:r>
+              <w:rPr>
+                <w:rFonts w:ascii="바탕" w:cs="바탕" w:eastAsia="바탕" w:hAnsi="바탕"/>
+                <w:b/>
+                <w:bCs/>
+                <w:sz w:val="24"/>
+                <w:szCs w:val="24"/>
+              </w:rPr>
+              <w:t xml:space="preserve">샌드 세레모니</w:t>
+            </w:r>
+          </w:p>
+        </w:tc>
+        <w:tc>
+          <w:tcPr>
+            <w:tcW w:type="dxa" w:w="7000"/>
+            <w:tcBorders>
+              <w:top w:val="single" w:color="000000" w:sz="6"/>
+              <w:left w:val="single" w:color="000000" w:sz="6"/>
+              <w:bottom w:val="single" w:color="000000" w:sz="6"/>
+              <w:right w:val="single" w:color="000000" w:sz="6"/>
+            </w:tcBorders>
+            <w:tcMar>
+              <w:top w:type="dxa" w:w="80"/>
+              <w:left w:type="dxa" w:w="120"/>
+              <w:bottom w:type="dxa" w:w="80"/>
+              <w:right w:type="dxa" w:w="120"/>
+            </w:tcMar>
+          </w:tcPr>
+          <w:p>
+            <w:pPr>
+              <w:spacing w:line="360"/>
+            </w:pPr>
+            <w:r>
+              <w:rPr>
+                <w:rFonts w:ascii="바탕" w:cs="바탕" w:eastAsia="바탕" w:hAnsi="바탕"/>
+                <w:b w:val="false"/>
+                <w:bCs w:val="false"/>
+                <w:color w:val="0000FF"/>
+                <w:sz w:val="24"/>
+                <w:szCs w:val="24"/>
+              </w:rPr>
+              <w:t xml:space="preserve"> 먼저 예식의 첫 순서로 양가 어머님들의 샌드 세레모니가 있겠습니다.</w:t>
+            </w:r>
+          </w:p>
+          <w:p>
+            <w:pPr>
+              <w:spacing w:line="360"/>
+            </w:pPr>
+            <w:r>
+              <w:rPr>
+                <w:rFonts w:ascii="바탕" w:cs="바탕" w:eastAsia="바탕" w:hAnsi="바탕"/>
+                <w:b w:val="false"/>
+                <w:bCs w:val="false"/>
+                <w:color w:val="0000FF"/>
+                <w:sz w:val="24"/>
+                <w:szCs w:val="24"/>
+              </w:rPr>
+              <w:t xml:space="preserve"> 샌드 세레모니는 신랑 신부 두 사람이 만나, 하나가 됨을 상징하고</w:t>
+            </w:r>
+          </w:p>
+          <w:p>
+            <w:pPr>
+              <w:spacing w:line="360"/>
+            </w:pPr>
+            <w:r>
+              <w:rPr>
+                <w:rFonts w:ascii="바탕" w:cs="바탕" w:eastAsia="바탕" w:hAnsi="바탕"/>
+                <w:b w:val="false"/>
+                <w:bCs w:val="false"/>
+                <w:color w:val="0000FF"/>
+                <w:sz w:val="24"/>
+                <w:szCs w:val="24"/>
+              </w:rPr>
+              <w:t xml:space="preserve"> 실외 결혼식의 장점을 살려 화촉점화가 아닌 샌드 세레모니로 진행되겠습니다.</w:t>
+            </w:r>
+          </w:p>
+          <w:p>
+            <w:pPr>
+              <w:spacing w:line="360"/>
+            </w:pPr>
+            <w:r>
+              <w:rPr>
+                <w:rFonts w:ascii="바탕" w:cs="바탕" w:eastAsia="바탕" w:hAnsi="바탕"/>
+                <w:b w:val="false"/>
+                <w:bCs w:val="false"/>
+                <w:sz w:val="24"/>
+                <w:szCs w:val="24"/>
+              </w:rPr>
+              <w:t xml:space="preserve"/>
+            </w:r>
+          </w:p>
+          <w:p>
+            <w:pPr>
+              <w:spacing w:line="360"/>
+            </w:pPr>
+            <w:r>
+              <w:rPr>
+                <w:rFonts w:ascii="바탕" w:cs="바탕" w:eastAsia="바탕" w:hAnsi="바탕"/>
+                <w:b w:val="false"/>
+                <w:bCs w:val="false"/>
+                <w:sz w:val="24"/>
+                <w:szCs w:val="24"/>
+              </w:rPr>
+              <w:t xml:space="preserve">(*준비 확인 후)</w:t>
+            </w:r>
+          </w:p>
+          <w:p>
+            <w:pPr>
+              <w:spacing w:line="360"/>
+            </w:pPr>
+            <w:r>
+              <w:rPr>
+                <w:rFonts w:ascii="바탕" w:cs="바탕" w:eastAsia="바탕" w:hAnsi="바탕"/>
+                <w:b w:val="false"/>
+                <w:bCs w:val="false"/>
+                <w:color w:val="FF0000"/>
+                <w:sz w:val="24"/>
+                <w:szCs w:val="24"/>
+              </w:rPr>
+              <w:t xml:space="preserve">- 2번 bgm(꽃날) 시작</w:t>
+            </w:r>
+          </w:p>
+        </w:tc>
+      </w:tr>
+      <w:tr>
+        <w:tc>
+          <w:tcPr>
+            <w:tcW w:type="dxa" w:w="2400"/>
+            <w:tcBorders>
+              <w:top w:val="single" w:color="000000" w:sz="6"/>
+              <w:left w:val="single" w:color="000000" w:sz="6"/>
+              <w:bottom w:val="single" w:color="000000" w:sz="6"/>
+              <w:right w:val="single" w:color="000000" w:sz="6"/>
+            </w:tcBorders>
+            <w:tcMar>
+              <w:top w:type="dxa" w:w="80"/>
+              <w:left w:type="dxa" w:w="120"/>
+              <w:bottom w:type="dxa" w:w="80"/>
+              <w:right w:type="dxa" w:w="120"/>
+            </w:tcMar>
+            <w:vAlign w:val="center"/>
+          </w:tcPr>
+          <w:p>
+            <w:pPr>
+              <w:spacing w:line="360"/>
+              <w:jc w:val="center"/>
+            </w:pPr>
+            <w:r>
+              <w:rPr>
+                <w:rFonts w:ascii="바탕" w:cs="바탕" w:eastAsia="바탕" w:hAnsi="바탕"/>
+                <w:b/>
+                <w:bCs/>
+                <w:sz w:val="24"/>
+                <w:szCs w:val="24"/>
+              </w:rPr>
+              <w:t xml:space="preserve">신랑 신부 맞절</w:t>
+            </w:r>
+          </w:p>
+        </w:tc>
+        <w:tc>
+          <w:tcPr>
+            <w:tcW w:type="dxa" w:w="7000"/>
+            <w:tcBorders>
+              <w:top w:val="single" w:color="000000" w:sz="6"/>
+              <w:left w:val="single" w:color="000000" w:sz="6"/>
+              <w:bottom w:val="single" w:color="000000" w:sz="6"/>
+              <w:right w:val="single" w:color="000000" w:sz="6"/>
+            </w:tcBorders>
+            <w:tcMar>
+              <w:top w:type="dxa" w:w="80"/>
+              <w:left w:type="dxa" w:w="120"/>
+              <w:bottom w:type="dxa" w:w="80"/>
+              <w:right w:type="dxa" w:w="120"/>
+            </w:tcMar>
+          </w:tcPr>
+          <w:p>
+            <w:pPr>
+              <w:spacing w:line="360"/>
+            </w:pPr>
+            <w:r>
+              <w:rPr>
+                <w:rFonts w:ascii="바탕" w:cs="바탕" w:eastAsia="바탕" w:hAnsi="바탕"/>
+                <w:b/>
+                <w:bCs/>
+                <w:sz w:val="24"/>
+                <w:szCs w:val="24"/>
+              </w:rPr>
+              <w:t xml:space="preserve">(진행자)</w:t>
+            </w:r>
+          </w:p>
+          <w:p>
+            <w:pPr>
+              <w:spacing w:line="360"/>
+            </w:pPr>
+            <w:r>
+              <w:rPr>
+                <w:rFonts w:ascii="바탕" w:cs="바탕" w:eastAsia="바탕" w:hAnsi="바탕"/>
+                <w:b/>
+                <w:bCs/>
+                <w:sz w:val="24"/>
+                <w:szCs w:val="24"/>
+              </w:rPr>
+              <w:t xml:space="preserve">(* 신부 아버님 착석 및 신랑 신부 확인 후)</w:t>
+            </w:r>
+          </w:p>
+          <w:p>
+            <w:pPr>
+              <w:spacing w:line="360"/>
+            </w:pPr>
+            <w:r>
+              <w:rPr>
+                <w:rFonts w:ascii="바탕" w:cs="바탕" w:eastAsia="바탕" w:hAnsi="바탕"/>
+                <w:b/>
+                <w:bCs/>
+                <w:sz w:val="24"/>
+                <w:szCs w:val="24"/>
+              </w:rPr>
+              <w:t xml:space="preserve">이제 두 사람이 여러 가족 앞에서 성인의 예를 갖추는 순서가 있겠습니다.</w:t>
+            </w:r>
+          </w:p>
+          <w:p>
+            <w:pPr>
+              <w:spacing w:line="360"/>
+            </w:pPr>
+            <w:r>
+              <w:rPr>
+                <w:rFonts w:ascii="바탕" w:cs="바탕" w:eastAsia="바탕" w:hAnsi="바탕"/>
+                <w:b/>
+                <w:bCs/>
+                <w:sz w:val="24"/>
+                <w:szCs w:val="24"/>
+              </w:rPr>
+              <w:t xml:space="preserve">신랑, 신부는 서로 마주보고 서 주시기 바랍니다.</w:t>
+            </w:r>
+          </w:p>
+          <w:p>
+            <w:pPr>
+              <w:spacing w:line="360"/>
+            </w:pPr>
+            <w:r>
+              <w:rPr>
+                <w:rFonts w:ascii="바탕" w:cs="바탕" w:eastAsia="바탕" w:hAnsi="바탕"/>
+                <w:b/>
+                <w:bCs/>
+                <w:sz w:val="24"/>
+                <w:szCs w:val="24"/>
+              </w:rPr>
+              <w:t xml:space="preserve">(* 마주본 것 확인 후)</w:t>
+            </w:r>
+          </w:p>
+          <w:p>
+            <w:pPr>
+              <w:spacing w:line="360"/>
+            </w:pPr>
+            <w:r>
+              <w:rPr>
+                <w:rFonts w:ascii="바탕" w:cs="바탕" w:eastAsia="바탕" w:hAnsi="바탕"/>
+                <w:b/>
+                <w:bCs/>
+                <w:sz w:val="24"/>
+                <w:szCs w:val="24"/>
+              </w:rPr>
+              <w:t xml:space="preserve">서로에 대한 사랑하는 눈빛과 존경의 마음과 예를 갖추어 맞절을 하겠습니다.</w:t>
+            </w:r>
+          </w:p>
+          <w:p>
+            <w:pPr>
+              <w:spacing w:line="360"/>
+            </w:pPr>
+            <w:r>
+              <w:rPr>
+                <w:rFonts w:ascii="바탕" w:cs="바탕" w:eastAsia="바탕" w:hAnsi="바탕"/>
+                <w:b/>
+                <w:bCs/>
+                <w:sz w:val="24"/>
+                <w:szCs w:val="24"/>
+              </w:rPr>
+              <w:t xml:space="preserve">“신랑, 신부 맞절”</w:t>
+            </w:r>
+          </w:p>
+          <w:p>
+            <w:pPr>
+              <w:spacing w:line="360"/>
+            </w:pPr>
+            <w:r>
+              <w:rPr>
+                <w:rFonts w:ascii="바탕" w:cs="바탕" w:eastAsia="바탕" w:hAnsi="바탕"/>
+                <w:b/>
+                <w:bCs/>
+                <w:sz w:val="24"/>
+                <w:szCs w:val="24"/>
+              </w:rPr>
+              <w:t xml:space="preserve">(* 인사가 끝난 후)</w:t>
+            </w:r>
+          </w:p>
+          <w:p>
+            <w:pPr>
+              <w:spacing w:line="360"/>
+            </w:pPr>
+            <w:r>
+              <w:rPr>
+                <w:rFonts w:ascii="바탕" w:cs="바탕" w:eastAsia="바탕" w:hAnsi="바탕"/>
+                <w:b/>
+                <w:bCs/>
+                <w:sz w:val="24"/>
+                <w:szCs w:val="24"/>
+              </w:rPr>
+              <w:t xml:space="preserve">(* 조카들이 신랑에게 마이크와 혼인 서약서 전달)</w:t>
+            </w:r>
+          </w:p>
+          <w:p>
+            <w:pPr>
+              <w:spacing w:line="360"/>
+            </w:pPr>
+            <w:r>
+              <w:rPr>
+                <w:rFonts w:ascii="바탕" w:cs="바탕" w:eastAsia="바탕" w:hAnsi="바탕"/>
+                <w:b w:val="false"/>
+                <w:bCs w:val="false"/>
+                <w:color w:val="FF0000"/>
+                <w:sz w:val="24"/>
+                <w:szCs w:val="24"/>
+              </w:rPr>
+              <w:t xml:space="preserve">-5번 bgm 끝</w:t>
+            </w:r>
+          </w:p>
+        </w:tc>
+      </w:tr>
+      <w:tr>
+        <w:tc>
+          <w:tcPr>
+            <w:tcW w:type="dxa" w:w="2400"/>
+            <w:tcBorders>
+              <w:top w:val="single" w:color="000000" w:sz="6"/>
+              <w:left w:val="single" w:color="000000" w:sz="6"/>
+              <w:bottom w:val="single" w:color="000000" w:sz="6"/>
+              <w:right w:val="single" w:color="000000" w:sz="6"/>
+            </w:tcBorders>
+            <w:tcMar>
+              <w:top w:type="dxa" w:w="80"/>
+              <w:left w:type="dxa" w:w="120"/>
+              <w:bottom w:type="dxa" w:w="80"/>
+              <w:right w:type="dxa" w:w="120"/>
+            </w:tcMar>
+            <w:vAlign w:val="center"/>
+          </w:tcPr>
+          <w:p>
+            <w:pPr>
+              <w:spacing w:line="360"/>
+              <w:jc w:val="center"/>
+            </w:pPr>
+            <w:r>
+              <w:rPr>
+                <w:rFonts w:ascii="바탕" w:cs="바탕" w:eastAsia="바탕" w:hAnsi="바탕"/>
+                <w:b/>
+                <w:bCs/>
+                <w:sz w:val="24"/>
+                <w:szCs w:val="24"/>
+              </w:rPr>
+              <w:t xml:space="preserve">혼인 서약</w:t>
+            </w:r>
+          </w:p>
+        </w:tc>
+        <w:tc>
+          <w:tcPr>
+            <w:tcW w:type="dxa" w:w="7000"/>
+            <w:tcBorders>
+              <w:top w:val="single" w:color="000000" w:sz="6"/>
+              <w:left w:val="single" w:color="000000" w:sz="6"/>
+              <w:bottom w:val="single" w:color="000000" w:sz="6"/>
+              <w:right w:val="single" w:color="000000" w:sz="6"/>
+            </w:tcBorders>
+            <w:tcMar>
+              <w:top w:type="dxa" w:w="80"/>
+              <w:left w:type="dxa" w:w="120"/>
+              <w:bottom w:type="dxa" w:w="80"/>
+              <w:right w:type="dxa" w:w="120"/>
+            </w:tcMar>
+          </w:tcPr>
+          <w:p>
+            <w:pPr>
+              <w:spacing w:line="360"/>
+            </w:pPr>
+            <w:r>
+              <w:rPr>
+                <w:rFonts w:ascii="바탕" w:cs="바탕" w:eastAsia="바탕" w:hAnsi="바탕"/>
+                <w:b w:val="false"/>
+                <w:bCs w:val="false"/>
+                <w:color w:val="0000FF"/>
+                <w:sz w:val="24"/>
+                <w:szCs w:val="24"/>
+              </w:rPr>
+              <w:t xml:space="preserve">(신랑) 디렉터님 진행에 도움을 주셔서 다시 한번 감사드립니다.</w:t>
+            </w:r>
+          </w:p>
+          <w:p>
+            <w:pPr>
+              <w:spacing w:line="360"/>
+            </w:pPr>
+            <w:r>
+              <w:rPr>
+                <w:rFonts w:ascii="바탕" w:cs="바탕" w:eastAsia="바탕" w:hAnsi="바탕"/>
+                <w:b w:val="false"/>
+                <w:bCs w:val="false"/>
+                <w:color w:val="0000FF"/>
+                <w:sz w:val="24"/>
+                <w:szCs w:val="24"/>
+              </w:rPr>
+              <w:t xml:space="preserve">이어서 저희 두사람이 서로에 대한 사랑을 다짐하는 혼인서약서를 낭독하도록</w:t>
+            </w:r>
+          </w:p>
+          <w:p>
+            <w:pPr>
+              <w:spacing w:line="360"/>
+            </w:pPr>
+            <w:r>
+              <w:rPr>
+                <w:rFonts w:ascii="바탕" w:cs="바탕" w:eastAsia="바탕" w:hAnsi="바탕"/>
+                <w:b w:val="false"/>
+                <w:bCs w:val="false"/>
+                <w:color w:val="0000FF"/>
+                <w:sz w:val="24"/>
+                <w:szCs w:val="24"/>
+              </w:rPr>
+              <w:t xml:space="preserve">하겠습니다. 신부 선영씨는 저를 다정하게 봐주시구요~^^</w:t>
+            </w:r>
+          </w:p>
+          <w:p>
+            <w:pPr>
+              <w:spacing w:line="360"/>
+            </w:pPr>
+            <w:r>
+              <w:rPr>
+                <w:rFonts w:ascii="바탕" w:cs="바탕" w:eastAsia="바탕" w:hAnsi="바탕"/>
+                <w:b w:val="false"/>
+                <w:bCs w:val="false"/>
+                <w:color w:val="0000FF"/>
+                <w:sz w:val="24"/>
+                <w:szCs w:val="24"/>
+              </w:rPr>
+              <w:t xml:space="preserve">자 이제 저희가 함께 혼인서약서를 낭독하겠습니다.</w:t>
+            </w:r>
+          </w:p>
+          <w:p>
+            <w:pPr>
+              <w:spacing w:line="360"/>
+            </w:pPr>
+            <w:r>
+              <w:rPr>
+                <w:rFonts w:ascii="바탕" w:cs="바탕" w:eastAsia="바탕" w:hAnsi="바탕"/>
+                <w:b w:val="false"/>
+                <w:bCs w:val="false"/>
+                <w:color w:val="FF0000"/>
+                <w:sz w:val="24"/>
+                <w:szCs w:val="24"/>
+              </w:rPr>
+              <w:t xml:space="preserve">-6번 bgm(Do You Remember the First Time We Met) 시작</w:t>
+            </w:r>
+          </w:p>
+          <w:p>
+            <w:pPr>
+              <w:spacing w:line="360"/>
+            </w:pPr>
+            <w:r>
+              <w:rPr>
+                <w:rFonts w:ascii="바탕" w:cs="바탕" w:eastAsia="바탕" w:hAnsi="바탕"/>
+                <w:b w:val="false"/>
+                <w:bCs w:val="false"/>
+                <w:sz w:val="24"/>
+                <w:szCs w:val="24"/>
+              </w:rPr>
+              <w:t xml:space="preserve">(혼인서약 낭독)</w:t>
+            </w:r>
+          </w:p>
+          <w:p>
+            <w:pPr>
+              <w:spacing w:line="360"/>
+            </w:pPr>
+            <w:r>
+              <w:rPr>
+                <w:rFonts w:ascii="바탕" w:cs="바탕" w:eastAsia="바탕" w:hAnsi="바탕"/>
+                <w:b w:val="false"/>
+                <w:bCs w:val="false"/>
+                <w:color w:val="FF0000"/>
+                <w:sz w:val="24"/>
+                <w:szCs w:val="24"/>
+              </w:rPr>
+              <w:t xml:space="preserve">-6번 bgm 끝</w:t>
+            </w:r>
+          </w:p>
+          <w:p>
+            <w:pPr>
+              <w:spacing w:line="360"/>
+            </w:pPr>
+            <w:r>
+              <w:rPr>
+                <w:rFonts w:ascii="바탕" w:cs="바탕" w:eastAsia="바탕" w:hAnsi="바탕"/>
+                <w:b w:val="false"/>
+                <w:bCs w:val="false"/>
+                <w:color w:val="7030A0"/>
+                <w:sz w:val="24"/>
+                <w:szCs w:val="24"/>
+              </w:rPr>
+              <w:t xml:space="preserve">신부) 네, 저희 두사람의 사랑의 서약 잘 들으셨죠?</w:t>
+            </w:r>
+          </w:p>
+          <w:p>
+            <w:pPr>
+              <w:spacing w:line="360"/>
+            </w:pPr>
+            <w:r>
+              <w:rPr>
+                <w:rFonts w:ascii="바탕" w:cs="바탕" w:eastAsia="바탕" w:hAnsi="바탕"/>
+                <w:b w:val="false"/>
+                <w:bCs w:val="false"/>
+                <w:color w:val="7030A0"/>
+                <w:sz w:val="24"/>
+                <w:szCs w:val="24"/>
+              </w:rPr>
+              <w:t xml:space="preserve">여기 자리해주신 여러분 모두가 증인이 되어 주셨습니다.</w:t>
+            </w:r>
+          </w:p>
+        </w:tc>
+      </w:tr>
+      <w:tr>
+        <w:tc>
+          <w:tcPr>
+            <w:tcW w:type="dxa" w:w="2400"/>
+            <w:tcBorders>
+              <w:top w:val="single" w:color="000000" w:sz="6"/>
+              <w:left w:val="single" w:color="000000" w:sz="6"/>
+              <w:bottom w:val="single" w:color="000000" w:sz="6"/>
+              <w:right w:val="single" w:color="000000" w:sz="6"/>
+            </w:tcBorders>
+            <w:tcMar>
+              <w:top w:type="dxa" w:w="80"/>
+              <w:left w:type="dxa" w:w="120"/>
+              <w:bottom w:type="dxa" w:w="80"/>
+              <w:right w:type="dxa" w:w="120"/>
+            </w:tcMar>
+            <w:vAlign w:val="center"/>
+          </w:tcPr>
+          <w:p>
+            <w:pPr>
+              <w:spacing w:line="360"/>
+              <w:jc w:val="center"/>
+            </w:pPr>
+            <w:r>
+              <w:rPr>
+                <w:rFonts w:ascii="바탕" w:cs="바탕" w:eastAsia="바탕" w:hAnsi="바탕"/>
+                <w:b/>
+                <w:bCs/>
+                <w:sz w:val="24"/>
+                <w:szCs w:val="24"/>
+              </w:rPr>
+              <w:t xml:space="preserve">반지 교환</w:t>
+            </w:r>
+          </w:p>
+        </w:tc>
+        <w:tc>
+          <w:tcPr>
+            <w:tcW w:type="dxa" w:w="7000"/>
+            <w:tcBorders>
+              <w:top w:val="single" w:color="000000" w:sz="6"/>
+              <w:left w:val="single" w:color="000000" w:sz="6"/>
+              <w:bottom w:val="single" w:color="000000" w:sz="6"/>
+              <w:right w:val="single" w:color="000000" w:sz="6"/>
+            </w:tcBorders>
+            <w:tcMar>
+              <w:top w:type="dxa" w:w="80"/>
+              <w:left w:type="dxa" w:w="120"/>
+              <w:bottom w:type="dxa" w:w="80"/>
+              <w:right w:type="dxa" w:w="120"/>
+            </w:tcMar>
+          </w:tcPr>
+          <w:p>
+            <w:pPr>
+              <w:spacing w:line="360"/>
+            </w:pPr>
+            <w:r>
+              <w:rPr>
+                <w:rFonts w:ascii="바탕" w:cs="바탕" w:eastAsia="바탕" w:hAnsi="바탕"/>
+                <w:b w:val="false"/>
+                <w:bCs w:val="false"/>
+                <w:color w:val="7030A0"/>
+                <w:sz w:val="24"/>
+                <w:szCs w:val="24"/>
+              </w:rPr>
+              <w:t xml:space="preserve">(신부) 이어서 서로의 사랑을 약속하는 증표로 반지를 서로 교환하는 순서입니다.</w:t>
+            </w:r>
+          </w:p>
+          <w:p>
+            <w:pPr>
+              <w:spacing w:line="360"/>
+            </w:pPr>
+            <w:r>
+              <w:rPr>
+                <w:rFonts w:ascii="바탕" w:cs="바탕" w:eastAsia="바탕" w:hAnsi="바탕"/>
+                <w:b w:val="false"/>
+                <w:bCs w:val="false"/>
+                <w:color w:val="FF0000"/>
+                <w:sz w:val="24"/>
+                <w:szCs w:val="24"/>
+              </w:rPr>
+              <w:t xml:space="preserve">-7번 bgm(New Spring Flowers) 시작</w:t>
+            </w:r>
+          </w:p>
+          <w:p>
+            <w:pPr>
+              <w:spacing w:line="360"/>
+            </w:pPr>
+            <w:r>
+              <w:rPr>
+                <w:rFonts w:ascii="바탕" w:cs="바탕" w:eastAsia="바탕" w:hAnsi="바탕"/>
+                <w:b/>
+                <w:bCs/>
+                <w:color w:val="0000FF"/>
+                <w:sz w:val="24"/>
+                <w:szCs w:val="24"/>
+              </w:rPr>
+              <w:t xml:space="preserve">(신랑) “제가 먼저 신부의 손에 반지를 끼워주겠습니다.”</w:t>
+            </w:r>
+          </w:p>
+          <w:p>
+            <w:pPr>
+              <w:spacing w:line="360"/>
+            </w:pPr>
+            <w:r>
+              <w:rPr>
+                <w:rFonts w:ascii="바탕" w:cs="바탕" w:eastAsia="바탕" w:hAnsi="바탕"/>
+                <w:b/>
+                <w:bCs/>
+                <w:sz w:val="24"/>
+                <w:szCs w:val="24"/>
+              </w:rPr>
+              <w:t xml:space="preserve">(신부도 신랑의 손에 반지를 끼워줌)</w:t>
+            </w:r>
+          </w:p>
+          <w:p>
+            <w:pPr>
+              <w:spacing w:line="360"/>
+            </w:pPr>
+            <w:r>
+              <w:rPr>
+                <w:rFonts w:ascii="바탕" w:cs="바탕" w:eastAsia="바탕" w:hAnsi="바탕"/>
+                <w:b w:val="false"/>
+                <w:bCs w:val="false"/>
+                <w:sz w:val="24"/>
+                <w:szCs w:val="24"/>
+              </w:rPr>
+              <w:t xml:space="preserve"/>
+            </w:r>
+          </w:p>
+          <w:p>
+            <w:pPr>
+              <w:spacing w:line="360"/>
+            </w:pPr>
+            <w:r>
+              <w:rPr>
+                <w:rFonts w:ascii="바탕" w:cs="바탕" w:eastAsia="바탕" w:hAnsi="바탕"/>
+                <w:b w:val="false"/>
+                <w:bCs w:val="false"/>
+                <w:sz w:val="24"/>
+                <w:szCs w:val="24"/>
+              </w:rPr>
+              <w:t xml:space="preserve">(*반지 교환 모두 완료 후 천천히 힘주어 멘트)</w:t>
+            </w:r>
+          </w:p>
+          <w:p>
+            <w:pPr>
+              <w:spacing w:line="360"/>
+            </w:pPr>
+            <w:r>
+              <w:rPr>
+                <w:rFonts w:ascii="바탕" w:cs="바탕" w:eastAsia="바탕" w:hAnsi="바탕"/>
+                <w:b w:val="false"/>
+                <w:bCs w:val="false"/>
+                <w:sz w:val="24"/>
+                <w:szCs w:val="24"/>
+              </w:rPr>
+              <w:t xml:space="preserve"/>
+            </w:r>
+          </w:p>
+          <w:p>
+            <w:pPr>
+              <w:spacing w:line="360"/>
+            </w:pPr>
+            <w:r>
+              <w:rPr>
+                <w:rFonts w:ascii="바탕" w:cs="바탕" w:eastAsia="바탕" w:hAnsi="바탕"/>
+                <w:b/>
+                <w:bCs/>
+                <w:color w:val="0000FF"/>
+                <w:sz w:val="24"/>
+                <w:szCs w:val="24"/>
+              </w:rPr>
+              <w:t xml:space="preserve">(신랑) 반지가 끊어짐 없는 완벽한 원을 그리듯이,</w:t>
+            </w:r>
+          </w:p>
+          <w:p>
+            <w:pPr>
+              <w:spacing w:line="360"/>
+            </w:pPr>
+            <w:r>
+              <w:rPr>
+                <w:rFonts w:ascii="바탕" w:cs="바탕" w:eastAsia="바탕" w:hAnsi="바탕"/>
+                <w:b/>
+                <w:bCs/>
+                <w:color w:val="7030A0"/>
+                <w:sz w:val="24"/>
+                <w:szCs w:val="24"/>
+              </w:rPr>
+              <w:t xml:space="preserve">(신부) 오늘 저희 두 사람의 사랑도 영원히 이어지기를 소망합니다.</w:t>
+            </w:r>
+          </w:p>
+          <w:p>
+            <w:pPr>
+              <w:spacing w:line="360"/>
+            </w:pPr>
+            <w:r>
+              <w:rPr>
+                <w:rFonts w:ascii="바탕" w:cs="바탕" w:eastAsia="바탕" w:hAnsi="바탕"/>
+                <w:b w:val="false"/>
+                <w:bCs w:val="false"/>
+                <w:sz w:val="24"/>
+                <w:szCs w:val="24"/>
+              </w:rPr>
+              <w:t xml:space="preserve"/>
+            </w:r>
+          </w:p>
+          <w:p>
+            <w:pPr>
+              <w:spacing w:line="360"/>
+            </w:pPr>
+            <w:r>
+              <w:rPr>
+                <w:rFonts w:ascii="바탕" w:cs="바탕" w:eastAsia="바탕" w:hAnsi="바탕"/>
+                <w:b w:val="false"/>
+                <w:bCs w:val="false"/>
+                <w:color w:val="7030A0"/>
+                <w:sz w:val="24"/>
+                <w:szCs w:val="24"/>
+              </w:rPr>
+              <w:t xml:space="preserve">(신부) 다시 한번 큰 박수 부탁드립니다.</w:t>
+            </w:r>
+          </w:p>
+          <w:p>
+            <w:pPr>
+              <w:spacing w:line="360"/>
+            </w:pPr>
+            <w:r>
+              <w:rPr>
+                <w:rFonts w:ascii="바탕" w:cs="바탕" w:eastAsia="바탕" w:hAnsi="바탕"/>
+                <w:b w:val="false"/>
+                <w:bCs w:val="false"/>
+                <w:color w:val="FF0000"/>
+                <w:sz w:val="24"/>
+                <w:szCs w:val="24"/>
+              </w:rPr>
+              <w:t xml:space="preserve">-7번 bgm끝</w:t>
+            </w:r>
+          </w:p>
+        </w:tc>
+      </w:tr>
+      <w:tr>
+        <w:tc>
+          <w:tcPr>
+            <w:tcW w:type="dxa" w:w="2400"/>
+            <w:tcBorders>
+              <w:top w:val="single" w:color="000000" w:sz="6"/>
+              <w:left w:val="single" w:color="000000" w:sz="6"/>
+              <w:bottom w:val="single" w:color="000000" w:sz="6"/>
+              <w:right w:val="single" w:color="000000" w:sz="6"/>
+            </w:tcBorders>
+            <w:tcMar>
+              <w:top w:type="dxa" w:w="80"/>
+              <w:left w:type="dxa" w:w="120"/>
+              <w:bottom w:type="dxa" w:w="80"/>
+              <w:right w:type="dxa" w:w="120"/>
+            </w:tcMar>
+            <w:vAlign w:val="center"/>
+          </w:tcPr>
+          <w:p>
+            <w:pPr>
+              <w:spacing w:line="360"/>
+              <w:jc w:val="center"/>
+            </w:pPr>
+            <w:r>
+              <w:rPr>
+                <w:rFonts w:ascii="바탕" w:cs="바탕" w:eastAsia="바탕" w:hAnsi="바탕"/>
+                <w:b/>
+                <w:bCs/>
+                <w:sz w:val="24"/>
+                <w:szCs w:val="24"/>
+              </w:rPr>
+              <w:t xml:space="preserve">인사</w:t>
+            </w:r>
+          </w:p>
+        </w:tc>
+        <w:tc>
+          <w:tcPr>
+            <w:tcW w:type="dxa" w:w="7000"/>
+            <w:tcBorders>
+              <w:top w:val="single" w:color="000000" w:sz="6"/>
+              <w:left w:val="single" w:color="000000" w:sz="6"/>
+              <w:bottom w:val="single" w:color="000000" w:sz="6"/>
+              <w:right w:val="single" w:color="000000" w:sz="6"/>
+            </w:tcBorders>
+            <w:tcMar>
+              <w:top w:type="dxa" w:w="80"/>
+              <w:left w:type="dxa" w:w="120"/>
+              <w:bottom w:type="dxa" w:w="80"/>
+              <w:right w:type="dxa" w:w="120"/>
+            </w:tcMar>
+          </w:tcPr>
+          <w:p>
+            <w:pPr>
+              <w:spacing w:line="360"/>
+            </w:pPr>
+            <w:r>
+              <w:rPr>
+                <w:rFonts w:ascii="바탕" w:cs="바탕" w:eastAsia="바탕" w:hAnsi="바탕"/>
+                <w:b w:val="false"/>
+                <w:bCs w:val="false"/>
+                <w:sz w:val="24"/>
+                <w:szCs w:val="24"/>
+              </w:rPr>
+              <w:t xml:space="preserve"/>
+            </w:r>
+          </w:p>
+          <w:p>
+            <w:pPr>
+              <w:spacing w:line="360"/>
+            </w:pPr>
+            <w:r>
+              <w:rPr>
+                <w:rFonts w:ascii="바탕" w:cs="바탕" w:eastAsia="바탕" w:hAnsi="바탕"/>
+                <w:b w:val="false"/>
+                <w:bCs w:val="false"/>
+                <w:color w:val="7030A0"/>
+                <w:sz w:val="24"/>
+                <w:szCs w:val="24"/>
+              </w:rPr>
+              <w:t xml:space="preserve"> (신부) 그럼 이번엔 부모님의 은혜에 앞으로 평생 보답하겠다는 의미로</w:t>
+            </w:r>
+          </w:p>
+          <w:p>
+            <w:pPr>
+              <w:spacing w:line="360"/>
+            </w:pPr>
+            <w:r>
+              <w:rPr>
+                <w:rFonts w:ascii="바탕" w:cs="바탕" w:eastAsia="바탕" w:hAnsi="바탕"/>
+                <w:b w:val="false"/>
+                <w:bCs w:val="false"/>
+                <w:color w:val="7030A0"/>
+                <w:sz w:val="24"/>
+                <w:szCs w:val="24"/>
+              </w:rPr>
+              <w:t xml:space="preserve"> 양가 부모님께 ‘키워주셔서 감사하고 앞으로 잘 살겠다’는 의미로</w:t>
+            </w:r>
+          </w:p>
+          <w:p>
+            <w:pPr>
+              <w:spacing w:line="360"/>
+            </w:pPr>
+            <w:r>
+              <w:rPr>
+                <w:rFonts w:ascii="바탕" w:cs="바탕" w:eastAsia="바탕" w:hAnsi="바탕"/>
+                <w:b w:val="false"/>
+                <w:bCs w:val="false"/>
+                <w:color w:val="7030A0"/>
+                <w:sz w:val="24"/>
+                <w:szCs w:val="24"/>
+              </w:rPr>
+              <w:t xml:space="preserve"> 인사를 드리도록 하겠습니다.</w:t>
+            </w:r>
+          </w:p>
+          <w:p>
+            <w:pPr>
+              <w:spacing w:line="360"/>
+            </w:pPr>
+            <w:r>
+              <w:rPr>
+                <w:rFonts w:ascii="바탕" w:cs="바탕" w:eastAsia="바탕" w:hAnsi="바탕"/>
+                <w:b w:val="false"/>
+                <w:bCs w:val="false"/>
+                <w:color w:val="0000FF"/>
+                <w:sz w:val="24"/>
+                <w:szCs w:val="24"/>
+              </w:rPr>
+              <w:t xml:space="preserve"> (신랑) 순서는 신부측 먼저 인사드리도록 하겠습니다.</w:t>
+            </w:r>
+          </w:p>
+          <w:p>
+            <w:pPr>
+              <w:spacing w:line="360"/>
+            </w:pPr>
+            <w:r>
+              <w:rPr>
+                <w:rFonts w:ascii="바탕" w:cs="바탕" w:eastAsia="바탕" w:hAnsi="바탕"/>
+                <w:b w:val="false"/>
+                <w:bCs w:val="false"/>
+                <w:sz w:val="24"/>
+                <w:szCs w:val="24"/>
+              </w:rPr>
+              <w:t xml:space="preserve"/>
+            </w:r>
+          </w:p>
+          <w:p>
+            <w:pPr>
+              <w:spacing w:line="360"/>
+            </w:pPr>
+            <w:r>
+              <w:rPr>
+                <w:rFonts w:ascii="바탕" w:cs="바탕" w:eastAsia="바탕" w:hAnsi="바탕"/>
+                <w:b w:val="false"/>
+                <w:bCs w:val="false"/>
+                <w:color w:val="FF0000"/>
+                <w:sz w:val="24"/>
+                <w:szCs w:val="24"/>
+              </w:rPr>
+              <w:t xml:space="preserve"> -8번 bgm (Can you feel the love tonight) 시작</w:t>
+            </w:r>
+          </w:p>
+          <w:p>
+            <w:pPr>
+              <w:spacing w:line="360"/>
+            </w:pPr>
+            <w:r>
+              <w:rPr>
+                <w:rFonts w:ascii="바탕" w:cs="바탕" w:eastAsia="바탕" w:hAnsi="바탕"/>
+                <w:b w:val="false"/>
+                <w:bCs w:val="false"/>
+                <w:sz w:val="24"/>
+                <w:szCs w:val="24"/>
+              </w:rPr>
+              <w:t xml:space="preserve"> (큰절)(포옹), (큰절)(포옹)</w:t>
+            </w:r>
+          </w:p>
+          <w:p>
+            <w:pPr>
+              <w:spacing w:line="360"/>
+            </w:pPr>
+            <w:r>
+              <w:rPr>
+                <w:rFonts w:ascii="바탕" w:cs="바탕" w:eastAsia="바탕" w:hAnsi="바탕"/>
+                <w:b w:val="false"/>
+                <w:bCs w:val="false"/>
+                <w:sz w:val="24"/>
+                <w:szCs w:val="24"/>
+              </w:rPr>
+              <w:t xml:space="preserve"> (자리로 돌아와서)</w:t>
+            </w:r>
+          </w:p>
+          <w:p>
+            <w:pPr>
+              <w:spacing w:line="360"/>
+            </w:pPr>
+            <w:r>
+              <w:rPr>
+                <w:rFonts w:ascii="바탕" w:cs="바탕" w:eastAsia="바탕" w:hAnsi="바탕"/>
+                <w:b w:val="false"/>
+                <w:bCs w:val="false"/>
+                <w:sz w:val="24"/>
+                <w:szCs w:val="24"/>
+              </w:rPr>
+              <w:t xml:space="preserve"/>
+            </w:r>
+          </w:p>
+          <w:p>
+            <w:pPr>
+              <w:spacing w:line="360"/>
+            </w:pPr>
+            <w:r>
+              <w:rPr>
+                <w:rFonts w:ascii="바탕" w:cs="바탕" w:eastAsia="바탕" w:hAnsi="바탕"/>
+                <w:b w:val="false"/>
+                <w:bCs w:val="false"/>
+                <w:color w:val="0000FF"/>
+                <w:sz w:val="24"/>
+                <w:szCs w:val="24"/>
+              </w:rPr>
+              <w:t xml:space="preserve"> (신랑) 마지막으로 오늘 저희의 결혼을 축하하기 위해</w:t>
+            </w:r>
+          </w:p>
+          <w:p>
+            <w:pPr>
+              <w:spacing w:line="360"/>
+            </w:pPr>
+            <w:r>
+              <w:rPr>
+                <w:rFonts w:ascii="바탕" w:cs="바탕" w:eastAsia="바탕" w:hAnsi="바탕"/>
+                <w:b w:val="false"/>
+                <w:bCs w:val="false"/>
+                <w:color w:val="0000FF"/>
+                <w:sz w:val="24"/>
+                <w:szCs w:val="24"/>
+              </w:rPr>
+              <w:t xml:space="preserve"> 이 자리를 빛내주신 가족 여러분께 감사 인사를 드리겠습니다.</w:t>
+            </w:r>
+          </w:p>
+          <w:p>
+            <w:pPr>
+              <w:spacing w:line="360"/>
+            </w:pPr>
+            <w:r>
+              <w:rPr>
+                <w:rFonts w:ascii="바탕" w:cs="바탕" w:eastAsia="바탕" w:hAnsi="바탕"/>
+                <w:b w:val="false"/>
+                <w:bCs w:val="false"/>
+                <w:sz w:val="24"/>
+                <w:szCs w:val="24"/>
+              </w:rPr>
+              <w:t xml:space="preserve"> (함께) “잘 살겠습니다~ 감사합니다~!”</w:t>
+            </w:r>
+          </w:p>
+          <w:p>
+            <w:pPr>
+              <w:spacing w:line="360"/>
+            </w:pPr>
+            <w:r>
+              <w:rPr>
+                <w:rFonts w:ascii="바탕" w:cs="바탕" w:eastAsia="바탕" w:hAnsi="바탕"/>
+                <w:b/>
+                <w:bCs/>
+                <w:sz w:val="24"/>
+                <w:szCs w:val="24"/>
+              </w:rPr>
+              <w:t xml:space="preserve"> (허리 숙여 맞추어 인사)</w:t>
+            </w:r>
+          </w:p>
+          <w:p>
+            <w:pPr>
+              <w:spacing w:line="360"/>
+            </w:pPr>
+            <w:r>
+              <w:rPr>
+                <w:rFonts w:ascii="바탕" w:cs="바탕" w:eastAsia="바탕" w:hAnsi="바탕"/>
+                <w:b w:val="false"/>
+                <w:bCs w:val="false"/>
+                <w:color w:val="FF0000"/>
+                <w:sz w:val="24"/>
+                <w:szCs w:val="24"/>
+              </w:rPr>
+              <w:t xml:space="preserve">-8번 bgm끝</w:t>
+            </w:r>
+          </w:p>
+        </w:tc>
+      </w:tr>
+      <w:tr>
+        <w:tc>
+          <w:tcPr>
+            <w:tcW w:type="dxa" w:w="2400"/>
+            <w:tcBorders>
+              <w:top w:val="single" w:color="000000" w:sz="6"/>
+              <w:left w:val="single" w:color="000000" w:sz="6"/>
+              <w:bottom w:val="single" w:color="000000" w:sz="6"/>
+              <w:right w:val="single" w:color="000000" w:sz="6"/>
+            </w:tcBorders>
+            <w:tcMar>
+              <w:top w:type="dxa" w:w="80"/>
+              <w:left w:type="dxa" w:w="120"/>
+              <w:bottom w:type="dxa" w:w="80"/>
+              <w:right w:type="dxa" w:w="120"/>
+            </w:tcMar>
+            <w:vAlign w:val="center"/>
+          </w:tcPr>
+          <w:p>
+            <w:pPr>
+              <w:spacing w:line="360"/>
+              <w:jc w:val="center"/>
+            </w:pPr>
+            <w:r>
+              <w:rPr>
+                <w:rFonts w:ascii="바탕" w:cs="바탕" w:eastAsia="바탕" w:hAnsi="바탕"/>
+                <w:b/>
+                <w:bCs/>
+                <w:sz w:val="24"/>
+                <w:szCs w:val="24"/>
+              </w:rPr>
+              <w:t xml:space="preserve">행진</w:t>
+            </w:r>
+          </w:p>
+          <w:p>
+            <w:pPr>
+              <w:spacing w:line="360"/>
+              <w:jc w:val="center"/>
+            </w:pPr>
+            <w:r>
+              <w:rPr>
+                <w:rFonts w:ascii="바탕" w:cs="바탕" w:eastAsia="바탕" w:hAnsi="바탕"/>
+                <w:b/>
+                <w:bCs/>
+                <w:sz w:val="24"/>
+                <w:szCs w:val="24"/>
+              </w:rPr>
+              <w:t xml:space="preserve">(신랑,신부)</w:t>
+            </w:r>
+          </w:p>
+        </w:tc>
+        <w:tc>
+          <w:tcPr>
+            <w:tcW w:type="dxa" w:w="7000"/>
+            <w:tcBorders>
+              <w:top w:val="single" w:color="000000" w:sz="6"/>
+              <w:left w:val="single" w:color="000000" w:sz="6"/>
+              <w:bottom w:val="single" w:color="000000" w:sz="6"/>
+              <w:right w:val="single" w:color="000000" w:sz="6"/>
+            </w:tcBorders>
+            <w:tcMar>
+              <w:top w:type="dxa" w:w="80"/>
+              <w:left w:type="dxa" w:w="120"/>
+              <w:bottom w:type="dxa" w:w="80"/>
+              <w:right w:type="dxa" w:w="120"/>
+            </w:tcMar>
+          </w:tcPr>
+          <w:p>
+            <w:pPr>
+              <w:spacing w:line="360"/>
+            </w:pPr>
+            <w:r>
+              <w:rPr>
+                <w:rFonts w:ascii="바탕" w:cs="바탕" w:eastAsia="바탕" w:hAnsi="바탕"/>
+                <w:b w:val="false"/>
+                <w:bCs w:val="false"/>
+                <w:sz w:val="24"/>
+                <w:szCs w:val="24"/>
+              </w:rPr>
+              <w:t xml:space="preserve">*준비상황 체크 후</w:t>
+            </w:r>
+          </w:p>
+          <w:p>
+            <w:pPr>
+              <w:spacing w:line="360"/>
+            </w:pPr>
+            <w:r>
+              <w:rPr>
+                <w:rFonts w:ascii="바탕" w:cs="바탕" w:eastAsia="바탕" w:hAnsi="바탕"/>
+                <w:b w:val="false"/>
+                <w:bCs w:val="false"/>
+                <w:color w:val="7030A0"/>
+                <w:sz w:val="24"/>
+                <w:szCs w:val="24"/>
+              </w:rPr>
+              <w:t xml:space="preserve"> (신부) 드디어 마지막 순서만 남았습니다.</w:t>
+            </w:r>
+          </w:p>
+          <w:p>
+            <w:pPr>
+              <w:spacing w:line="360"/>
+            </w:pPr>
+            <w:r>
+              <w:rPr>
+                <w:rFonts w:ascii="바탕" w:cs="바탕" w:eastAsia="바탕" w:hAnsi="바탕"/>
+                <w:b w:val="false"/>
+                <w:bCs w:val="false"/>
+                <w:color w:val="7030A0"/>
+                <w:sz w:val="24"/>
+                <w:szCs w:val="24"/>
+              </w:rPr>
+              <w:t xml:space="preserve">자리해 주신 여러분들의 축복 속에서 저희 부부가 함께</w:t>
+            </w:r>
+          </w:p>
+          <w:p>
+            <w:pPr>
+              <w:spacing w:line="360"/>
+            </w:pPr>
+            <w:r>
+              <w:rPr>
+                <w:rFonts w:ascii="바탕" w:cs="바탕" w:eastAsia="바탕" w:hAnsi="바탕"/>
+                <w:b w:val="false"/>
+                <w:bCs w:val="false"/>
+                <w:color w:val="7030A0"/>
+                <w:sz w:val="24"/>
+                <w:szCs w:val="24"/>
+              </w:rPr>
+              <w:t xml:space="preserve">행복한 미래를 꿈꾸며 내딛을 씩씩한 행진으로 마무리 하도록 하겠습니다.</w:t>
+            </w:r>
+          </w:p>
+          <w:p>
+            <w:pPr>
+              <w:spacing w:line="360"/>
+            </w:pPr>
+            <w:r>
+              <w:rPr>
+                <w:rFonts w:ascii="바탕" w:cs="바탕" w:eastAsia="바탕" w:hAnsi="바탕"/>
+                <w:b w:val="false"/>
+                <w:bCs w:val="false"/>
+                <w:color w:val="0000FF"/>
+                <w:sz w:val="24"/>
+                <w:szCs w:val="24"/>
+              </w:rPr>
+              <w:t xml:space="preserve">(신랑) ‘둘’이었던 저희 두 사람이 드디어 ‘하나’가 되었습니다.</w:t>
+            </w:r>
+          </w:p>
+          <w:p>
+            <w:pPr>
+              <w:spacing w:line="360"/>
+            </w:pPr>
+            <w:r>
+              <w:rPr>
+                <w:rFonts w:ascii="바탕" w:cs="바탕" w:eastAsia="바탕" w:hAnsi="바탕"/>
+                <w:b w:val="false"/>
+                <w:bCs w:val="false"/>
+                <w:color w:val="0000FF"/>
+                <w:sz w:val="24"/>
+                <w:szCs w:val="24"/>
+              </w:rPr>
+              <w:t xml:space="preserve">저희 앞날을 향해 힘찬 첫 발걸음을 내딛겠습니다~!</w:t>
+            </w:r>
+          </w:p>
+          <w:p>
+            <w:pPr>
+              <w:spacing w:line="360"/>
+            </w:pPr>
+            <w:r>
+              <w:rPr>
+                <w:rFonts w:ascii="바탕" w:cs="바탕" w:eastAsia="바탕" w:hAnsi="바탕"/>
+                <w:b w:val="false"/>
+                <w:bCs w:val="false"/>
+                <w:sz w:val="24"/>
+                <w:szCs w:val="24"/>
+              </w:rPr>
+              <w:t xml:space="preserve"/>
+            </w:r>
+          </w:p>
+          <w:p>
+            <w:pPr>
+              <w:spacing w:line="360"/>
+            </w:pPr>
+            <w:r>
+              <w:rPr>
+                <w:rFonts w:ascii="바탕" w:cs="바탕" w:eastAsia="바탕" w:hAnsi="바탕"/>
+                <w:b/>
+                <w:bCs/>
+                <w:sz w:val="24"/>
+                <w:szCs w:val="24"/>
+              </w:rPr>
+              <w:t xml:space="preserve">(함께) 저희가 행진할 동안 여러분들께서는 모두 계신 자리에서 일어나 주셔서</w:t>
+            </w:r>
+          </w:p>
+          <w:p>
+            <w:pPr>
+              <w:spacing w:line="360"/>
+            </w:pPr>
+            <w:r>
+              <w:rPr>
+                <w:rFonts w:ascii="바탕" w:cs="바탕" w:eastAsia="바탕" w:hAnsi="바탕"/>
+                <w:b/>
+                <w:bCs/>
+                <w:sz w:val="24"/>
+                <w:szCs w:val="24"/>
+              </w:rPr>
+              <w:t xml:space="preserve">따뜻한 격려와 뜨거운 축복의 박수로 함께 응원해주시면 감사하겠습니다.</w:t>
+            </w:r>
+          </w:p>
+          <w:p>
+            <w:pPr>
+              <w:spacing w:line="360"/>
+            </w:pPr>
+            <w:r>
+              <w:rPr>
+                <w:rFonts w:ascii="바탕" w:cs="바탕" w:eastAsia="바탕" w:hAnsi="바탕"/>
+                <w:b w:val="false"/>
+                <w:bCs w:val="false"/>
+                <w:sz w:val="24"/>
+                <w:szCs w:val="24"/>
+              </w:rPr>
+              <w:t xml:space="preserve"/>
+            </w:r>
+          </w:p>
+          <w:p>
+            <w:pPr>
+              <w:spacing w:line="360"/>
+            </w:pPr>
+            <w:r>
+              <w:rPr>
+                <w:rFonts w:ascii="바탕" w:cs="바탕" w:eastAsia="바탕" w:hAnsi="바탕"/>
+                <w:b w:val="false"/>
+                <w:bCs w:val="false"/>
+                <w:sz w:val="24"/>
+                <w:szCs w:val="24"/>
+              </w:rPr>
+              <w:t xml:space="preserve">*일어나신 것 확인 후</w:t>
+            </w:r>
+          </w:p>
+          <w:p>
+            <w:pPr>
+              <w:spacing w:line="360"/>
+            </w:pPr>
+            <w:r>
+              <w:rPr>
+                <w:rFonts w:ascii="바탕" w:cs="바탕" w:eastAsia="바탕" w:hAnsi="바탕"/>
+                <w:b/>
+                <w:bCs/>
+                <w:color w:val="0000FF"/>
+                <w:sz w:val="24"/>
+                <w:szCs w:val="24"/>
+              </w:rPr>
+              <w:t xml:space="preserve">(신랑) 그럼 행진하겠습니다.</w:t>
+            </w:r>
+          </w:p>
+          <w:p>
+            <w:pPr>
+              <w:spacing w:line="360"/>
+            </w:pPr>
+            <w:r>
+              <w:rPr>
+                <w:rFonts w:ascii="바탕" w:cs="바탕" w:eastAsia="바탕" w:hAnsi="바탕"/>
+                <w:b w:val="false"/>
+                <w:bCs w:val="false"/>
+                <w:color w:val="FF0000"/>
+                <w:sz w:val="24"/>
+                <w:szCs w:val="24"/>
+              </w:rPr>
+              <w:t xml:space="preserve">-9번 bgm(A Lover's Concerto) 시작</w:t>
+            </w:r>
+          </w:p>
+        </w:tc>
+      </w:tr>
+      <w:tr>
+        <w:tc>
+          <w:tcPr>
+            <w:tcW w:type="dxa" w:w="2400"/>
+            <w:tcBorders>
+              <w:top w:val="single" w:color="000000" w:sz="6"/>
+              <w:left w:val="single" w:color="000000" w:sz="6"/>
+              <w:bottom w:val="single" w:color="000000" w:sz="6"/>
+              <w:right w:val="single" w:color="000000" w:sz="6"/>
+            </w:tcBorders>
+            <w:tcMar>
+              <w:top w:type="dxa" w:w="80"/>
+              <w:left w:type="dxa" w:w="120"/>
+              <w:bottom w:type="dxa" w:w="80"/>
+              <w:right w:type="dxa" w:w="120"/>
+            </w:tcMar>
+            <w:vAlign w:val="center"/>
+          </w:tcPr>
+          <w:p>
+            <w:pPr>
+              <w:spacing w:line="360"/>
+              <w:jc w:val="center"/>
+            </w:pPr>
+            <w:r>
+              <w:rPr>
+                <w:rFonts w:ascii="바탕" w:cs="바탕" w:eastAsia="바탕" w:hAnsi="바탕"/>
+                <w:b/>
+                <w:bCs/>
+                <w:sz w:val="24"/>
+                <w:szCs w:val="24"/>
+              </w:rPr>
+              <w:t xml:space="preserve">폐회사</w:t>
+            </w:r>
+          </w:p>
+        </w:tc>
+        <w:tc>
+          <w:tcPr>
+            <w:tcW w:type="dxa" w:w="7000"/>
+            <w:tcBorders>
+              <w:top w:val="single" w:color="000000" w:sz="6"/>
+              <w:left w:val="single" w:color="000000" w:sz="6"/>
+              <w:bottom w:val="single" w:color="000000" w:sz="6"/>
+              <w:right w:val="single" w:color="000000" w:sz="6"/>
+            </w:tcBorders>
+            <w:tcMar>
+              <w:top w:type="dxa" w:w="80"/>
+              <w:left w:type="dxa" w:w="120"/>
+              <w:bottom w:type="dxa" w:w="80"/>
+              <w:right w:type="dxa" w:w="120"/>
+            </w:tcMar>
+          </w:tcPr>
+          <w:p>
+            <w:pPr>
+              <w:spacing w:line="360"/>
+            </w:pPr>
+            <w:r>
+              <w:rPr>
+                <w:rFonts w:ascii="바탕" w:cs="바탕" w:eastAsia="바탕" w:hAnsi="바탕"/>
+                <w:b w:val="false"/>
+                <w:bCs w:val="false"/>
+                <w:color w:val="FF0000"/>
+                <w:sz w:val="24"/>
+                <w:szCs w:val="24"/>
+              </w:rPr>
+              <w:t xml:space="preserve">-9번 bgm끝</w:t>
+            </w:r>
+          </w:p>
+          <w:p>
+            <w:pPr>
+              <w:spacing w:line="360"/>
+            </w:pPr>
+            <w:r>
+              <w:rPr>
+                <w:rFonts w:ascii="바탕" w:cs="바탕" w:eastAsia="바탕" w:hAnsi="바탕"/>
+                <w:b w:val="false"/>
+                <w:bCs w:val="false"/>
+                <w:sz w:val="24"/>
+                <w:szCs w:val="24"/>
+              </w:rPr>
+              <w:t xml:space="preserve">이상으로 신랑 유승수 군과 신부 이선영 양의 결혼식을 모두 마치겠습니다.</w:t>
+            </w:r>
+          </w:p>
+          <w:p>
+            <w:pPr>
+              <w:spacing w:line="360"/>
+              <w:jc w:val="right"/>
+            </w:pPr>
+            <w:r>
+              <w:rPr>
+                <w:rFonts w:ascii="바탕" w:cs="바탕" w:eastAsia="바탕" w:hAnsi="바탕"/>
+                <w:b/>
+                <w:bCs/>
+                <w:sz w:val="24"/>
+                <w:szCs w:val="24"/>
+              </w:rPr>
+              <w:t xml:space="preserve">총괄디렉팅 &amp; 플라워 : 헤이든 웨딩 (010-2828-4401)</w:t>
             </w:r>
           </w:p>
         </w:tc>

</xml_diff>

<commit_message>
Add flower girl ring delivery script
Co-Authored-By: Claude Sonnet 5.5 <noreply@anthropic.com>
Claude-Session: https://claude.ai/code/session_01UdK4F1Z4Jg3Yw7GwzFQFXX
</commit_message>
<xml_diff>
--- a/사회자_대본.docx
+++ b/사회자_대본.docx
@@ -1232,6 +1232,69 @@
                 <w:rFonts w:ascii="바탕" w:cs="바탕" w:eastAsia="바탕" w:hAnsi="바탕"/>
                 <w:b w:val="false"/>
                 <w:bCs w:val="false"/>
+                <w:color w:val="0000FF"/>
+                <w:sz w:val="24"/>
+                <w:szCs w:val="24"/>
+              </w:rPr>
+              <w:t xml:space="preserve">(신랑) 오늘 반지는 아주 특별한 친구가 저희에게 전해주기로 했습니다.</w:t>
+            </w:r>
+          </w:p>
+          <w:p>
+            <w:pPr>
+              <w:spacing w:line="360"/>
+            </w:pPr>
+            <w:r>
+              <w:rPr>
+                <w:rFonts w:ascii="바탕" w:cs="바탕" w:eastAsia="바탕" w:hAnsi="바탕"/>
+                <w:b w:val="false"/>
+                <w:bCs w:val="false"/>
+                <w:color w:val="7030A0"/>
+                <w:sz w:val="24"/>
+                <w:szCs w:val="24"/>
+              </w:rPr>
+              <w:t xml:space="preserve">(신부) 신부측 조카, 문나윤 양이 반지를 들고 입장하겠습니다.</w:t>
+            </w:r>
+          </w:p>
+          <w:p>
+            <w:pPr>
+              <w:spacing w:line="360"/>
+            </w:pPr>
+            <w:r>
+              <w:rPr>
+                <w:rFonts w:ascii="바탕" w:cs="바탕" w:eastAsia="바탕" w:hAnsi="바탕"/>
+                <w:b w:val="false"/>
+                <w:bCs w:val="false"/>
+                <w:color w:val="0000FF"/>
+                <w:sz w:val="24"/>
+                <w:szCs w:val="24"/>
+              </w:rPr>
+              <w:t xml:space="preserve">(신랑) 귀여운 화동에게 큰 박수와 환호 부탁드립니다!</w:t>
+            </w:r>
+          </w:p>
+          <w:p>
+            <w:pPr>
+              <w:spacing w:line="360"/>
+            </w:pPr>
+            <w:r>
+              <w:rPr>
+                <w:rFonts w:ascii="바탕" w:cs="바탕" w:eastAsia="바탕" w:hAnsi="바탕"/>
+                <w:b w:val="false"/>
+                <w:bCs w:val="false"/>
+                <w:sz w:val="24"/>
+                <w:szCs w:val="24"/>
+              </w:rPr>
+              <w:t xml:space="preserve"/>
+            </w:r>
+          </w:p>
+          <w:p>
+            <w:pPr>
+              <w:spacing w:line="360"/>
+            </w:pPr>
+            <w:r>
+              <w:rPr>
+                <w:rFonts w:ascii="바탕" w:cs="바탕" w:eastAsia="바탕" w:hAnsi="바탕"/>
+                <w:b w:val="false"/>
+                <w:bCs w:val="false"/>
                 <w:color w:val="FF0000"/>
                 <w:sz w:val="24"/>
                 <w:szCs w:val="24"/>
@@ -1246,6 +1309,83 @@
             <w:r>
               <w:rPr>
                 <w:rFonts w:ascii="바탕" w:cs="바탕" w:eastAsia="바탕" w:hAnsi="바탕"/>
+                <w:b w:val="false"/>
+                <w:bCs w:val="false"/>
+                <w:sz w:val="24"/>
+                <w:szCs w:val="24"/>
+              </w:rPr>
+              <w:t xml:space="preserve">(* 화동 문나윤 양 입장 - 신랑 신부에게 반지 전달)</w:t>
+            </w:r>
+          </w:p>
+          <w:p>
+            <w:pPr>
+              <w:spacing w:line="360"/>
+            </w:pPr>
+            <w:r>
+              <w:rPr>
+                <w:rFonts w:ascii="바탕" w:cs="바탕" w:eastAsia="바탕" w:hAnsi="바탕"/>
+                <w:b w:val="false"/>
+                <w:bCs w:val="false"/>
+                <w:sz w:val="24"/>
+                <w:szCs w:val="24"/>
+              </w:rPr>
+              <w:t xml:space="preserve"/>
+            </w:r>
+          </w:p>
+          <w:p>
+            <w:pPr>
+              <w:spacing w:line="360"/>
+            </w:pPr>
+            <w:r>
+              <w:rPr>
+                <w:rFonts w:ascii="바탕" w:cs="바탕" w:eastAsia="바탕" w:hAnsi="바탕"/>
+                <w:b w:val="false"/>
+                <w:bCs w:val="false"/>
+                <w:color w:val="0000FF"/>
+                <w:sz w:val="24"/>
+                <w:szCs w:val="24"/>
+              </w:rPr>
+              <w:t xml:space="preserve">(신랑) 나윤아, 반지 전해줘서 고마워~</w:t>
+            </w:r>
+          </w:p>
+          <w:p>
+            <w:pPr>
+              <w:spacing w:line="360"/>
+            </w:pPr>
+            <w:r>
+              <w:rPr>
+                <w:rFonts w:ascii="바탕" w:cs="바탕" w:eastAsia="바탕" w:hAnsi="바탕"/>
+                <w:b w:val="false"/>
+                <w:bCs w:val="false"/>
+                <w:color w:val="7030A0"/>
+                <w:sz w:val="24"/>
+                <w:szCs w:val="24"/>
+              </w:rPr>
+              <w:t xml:space="preserve">(신부) 나윤이가 전해준 이 반지, 서로의 손에 끼워주겠습니다.</w:t>
+            </w:r>
+          </w:p>
+          <w:p>
+            <w:pPr>
+              <w:spacing w:line="360"/>
+            </w:pPr>
+            <w:r>
+              <w:rPr>
+                <w:rFonts w:ascii="바탕" w:cs="바탕" w:eastAsia="바탕" w:hAnsi="바탕"/>
+                <w:b w:val="false"/>
+                <w:bCs w:val="false"/>
+                <w:sz w:val="24"/>
+                <w:szCs w:val="24"/>
+              </w:rPr>
+              <w:t xml:space="preserve"/>
+            </w:r>
+          </w:p>
+          <w:p>
+            <w:pPr>
+              <w:spacing w:line="360"/>
+            </w:pPr>
+            <w:r>
+              <w:rPr>
+                <w:rFonts w:ascii="바탕" w:cs="바탕" w:eastAsia="바탕" w:hAnsi="바탕"/>
                 <w:b/>
                 <w:bCs/>
                 <w:color w:val="0000FF"/>
@@ -1360,6 +1500,22 @@
                 <w:szCs w:val="24"/>
               </w:rPr>
               <w:t xml:space="preserve"/>
+            </w:r>
+          </w:p>
+          <w:p>
+            <w:pPr>
+              <w:spacing w:line="360"/>
+            </w:pPr>
+            <w:r>
+              <w:rPr>
+                <w:rFonts w:ascii="바탕" w:cs="바탕" w:eastAsia="바탕" w:hAnsi="바탕"/>
+                <w:b w:val="false"/>
+                <w:bCs w:val="false"/>
+                <w:color w:val="7030A0"/>
+                <w:sz w:val="24"/>
+                <w:szCs w:val="24"/>
+              </w:rPr>
+              <w:t xml:space="preserve">(신부) 반지를 전해준 화동 문나윤 양에게도 큰 박수 부탁드립니다.</w:t>
             </w:r>
           </w:p>
           <w:p>

</xml_diff>

<commit_message>
Tone down script wording and add groom's song section
Co-Authored-By: Claude Sonnet 5.5 <noreply@anthropic.com>
Claude-Session: https://claude.ai/code/session_01UdK4F1Z4Jg3Yw7GwzFQFXX
</commit_message>
<xml_diff>
--- a/사회자_대본.docx
+++ b/사회자_대본.docx
@@ -336,23 +336,7 @@
                 <w:sz w:val="24"/>
                 <w:szCs w:val="24"/>
               </w:rPr>
-              <w:t xml:space="preserve">오늘 예식은 특별히 저희의 진심이 전달될 수 있도록</w:t>
-            </w:r>
-          </w:p>
-          <w:p>
-            <w:pPr>
-              <w:spacing w:line="360"/>
-            </w:pPr>
-            <w:r>
-              <w:rPr>
-                <w:rFonts w:ascii="바탕" w:cs="바탕" w:eastAsia="바탕" w:hAnsi="바탕"/>
-                <w:b w:val="false"/>
-                <w:bCs w:val="false"/>
-                <w:color w:val="0000FF"/>
-                <w:sz w:val="24"/>
-                <w:szCs w:val="24"/>
-              </w:rPr>
-              <w:t xml:space="preserve">주례도, 사회도 없이 신랑 신부가 진행하는 예식입니다.</w:t>
+              <w:t xml:space="preserve">오늘 예식은 주례도, 사회도 없이 신랑 신부가 직접 진행하는 예식입니다.</w:t>
             </w:r>
           </w:p>
           <w:p>
@@ -415,39 +399,7 @@
                 <w:sz w:val="24"/>
                 <w:szCs w:val="24"/>
               </w:rPr>
-              <w:t xml:space="preserve">또한, 저희 두사람이 부부가 되는 즐겁고 화목한 가족 예식의 사회를</w:t>
-            </w:r>
-          </w:p>
-          <w:p>
-            <w:pPr>
-              <w:spacing w:line="360"/>
-            </w:pPr>
-            <w:r>
-              <w:rPr>
-                <w:rFonts w:ascii="바탕" w:cs="바탕" w:eastAsia="바탕" w:hAnsi="바탕"/>
-                <w:b w:val="false"/>
-                <w:bCs w:val="false"/>
-                <w:color w:val="0000FF"/>
-                <w:sz w:val="24"/>
-                <w:szCs w:val="24"/>
-              </w:rPr>
-              <w:t xml:space="preserve">좀 더 자유로운 분위기에서 직접 진행하는 만큼,</w:t>
-            </w:r>
-          </w:p>
-          <w:p>
-            <w:pPr>
-              <w:spacing w:line="360"/>
-            </w:pPr>
-            <w:r>
-              <w:rPr>
-                <w:rFonts w:ascii="바탕" w:cs="바탕" w:eastAsia="바탕" w:hAnsi="바탕"/>
-                <w:b w:val="false"/>
-                <w:bCs w:val="false"/>
-                <w:color w:val="0000FF"/>
-                <w:sz w:val="24"/>
-                <w:szCs w:val="24"/>
-              </w:rPr>
-              <w:t xml:space="preserve">미흡한 점이 있어도 예쁘게 봐주시고</w:t>
+              <w:t xml:space="preserve">또한, 사회를 직접 진행하는 만큼 미흡한 점이 있어도 너그럽게 봐주시고</w:t>
             </w:r>
           </w:p>
           <w:p>
@@ -479,23 +431,7 @@
                 <w:sz w:val="24"/>
                 <w:szCs w:val="24"/>
               </w:rPr>
-              <w:t xml:space="preserve">가족 결혼식인 만큼, 여기 계신 가족 분들께서 사랑의 증인으로</w:t>
-            </w:r>
-          </w:p>
-          <w:p>
-            <w:pPr>
-              <w:spacing w:line="360"/>
-            </w:pPr>
-            <w:r>
-              <w:rPr>
-                <w:rFonts w:ascii="바탕" w:cs="바탕" w:eastAsia="바탕" w:hAnsi="바탕"/>
-                <w:b w:val="false"/>
-                <w:bCs w:val="false"/>
-                <w:color w:val="0000FF"/>
-                <w:sz w:val="24"/>
-                <w:szCs w:val="24"/>
-              </w:rPr>
-              <w:t xml:space="preserve">더 큰 마음으로 함께 해주시기를 부탁드립니다.</w:t>
+              <w:t xml:space="preserve">가족 결혼식인 만큼, 여기 계신 가족분들께서 증인이 되어 함께해 주시기 바랍니다.</w:t>
             </w:r>
           </w:p>
           <w:p>
@@ -541,39 +477,23 @@
                 <w:sz w:val="24"/>
                 <w:szCs w:val="24"/>
               </w:rPr>
-              <w:t xml:space="preserve">제가 시작하겠습니다- 하면 큰 박수와 환호성으로 저희를 축복해주시면</w:t>
-            </w:r>
-          </w:p>
-          <w:p>
-            <w:pPr>
-              <w:spacing w:line="360"/>
-            </w:pPr>
-            <w:r>
-              <w:rPr>
-                <w:rFonts w:ascii="바탕" w:cs="바탕" w:eastAsia="바탕" w:hAnsi="바탕"/>
-                <w:b w:val="false"/>
-                <w:bCs w:val="false"/>
-                <w:color w:val="0000FF"/>
-                <w:sz w:val="24"/>
-                <w:szCs w:val="24"/>
-              </w:rPr>
-              <w:t xml:space="preserve">감사하겠습니다. 지금부터 작지만 매우 아름다운 결혼식을 큰 박수와 환호로</w:t>
-            </w:r>
-          </w:p>
-          <w:p>
-            <w:pPr>
-              <w:spacing w:line="360"/>
-            </w:pPr>
-            <w:r>
-              <w:rPr>
-                <w:rFonts w:ascii="바탕" w:cs="바탕" w:eastAsia="바탕" w:hAnsi="바탕"/>
-                <w:b w:val="false"/>
-                <w:bCs w:val="false"/>
-                <w:color w:val="0000FF"/>
-                <w:sz w:val="24"/>
-                <w:szCs w:val="24"/>
-              </w:rPr>
-              <w:t xml:space="preserve">시작하겠습니다!</w:t>
+              <w:t xml:space="preserve">제가 “시작하겠습니다” 하면 큰 박수 부탁드립니다.</w:t>
+            </w:r>
+          </w:p>
+          <w:p>
+            <w:pPr>
+              <w:spacing w:line="360"/>
+            </w:pPr>
+            <w:r>
+              <w:rPr>
+                <w:rFonts w:ascii="바탕" w:cs="바탕" w:eastAsia="바탕" w:hAnsi="바탕"/>
+                <w:b w:val="false"/>
+                <w:bCs w:val="false"/>
+                <w:color w:val="0000FF"/>
+                <w:sz w:val="24"/>
+                <w:szCs w:val="24"/>
+              </w:rPr>
+              <w:t xml:space="preserve">지금부터 결혼식을 시작하겠습니다!</w:t>
             </w:r>
           </w:p>
           <w:p>
@@ -894,7 +814,7 @@
                 <w:sz w:val="24"/>
                 <w:szCs w:val="24"/>
               </w:rPr>
-              <w:t xml:space="preserve">서로에 대한 사랑하는 눈빛과 존경의 마음과 예를 갖추어 맞절을 하겠습니다.</w:t>
+              <w:t xml:space="preserve">서로에게 존경과 예를 갖추어 맞절을 하겠습니다.</w:t>
             </w:r>
           </w:p>
           <w:p>
@@ -1056,7 +976,7 @@
                 <w:sz w:val="24"/>
                 <w:szCs w:val="24"/>
               </w:rPr>
-              <w:t xml:space="preserve">하겠습니다. 신부 선영씨는 저를 다정하게 봐주시구요~^^</w:t>
+              <w:t xml:space="preserve">하겠습니다. 선영씨, 저를 봐주세요.</w:t>
             </w:r>
           </w:p>
           <w:p>
@@ -1135,7 +1055,7 @@
                 <w:sz w:val="24"/>
                 <w:szCs w:val="24"/>
               </w:rPr>
-              <w:t xml:space="preserve">신부) 네, 저희 두사람의 사랑의 서약 잘 들으셨죠?</w:t>
+              <w:t xml:space="preserve">(신부) 네, 저희 두 사람의 서약 잘 들으셨죠?</w:t>
             </w:r>
           </w:p>
           <w:p>
@@ -1151,7 +1071,7 @@
                 <w:sz w:val="24"/>
                 <w:szCs w:val="24"/>
               </w:rPr>
-              <w:t xml:space="preserve">여기 자리해주신 여러분 모두가 증인이 되어 주셨습니다.</w:t>
+              <w:t xml:space="preserve">여기 계신 모든 분이 증인이 되어 주셨습니다.</w:t>
             </w:r>
           </w:p>
         </w:tc>
@@ -1220,23 +1140,23 @@
                 <w:sz w:val="24"/>
                 <w:szCs w:val="24"/>
               </w:rPr>
-              <w:t xml:space="preserve">(신부) 이어서 서로의 사랑을 약속하는 증표로 반지를 서로 교환하는 순서입니다.</w:t>
-            </w:r>
-          </w:p>
-          <w:p>
-            <w:pPr>
-              <w:spacing w:line="360"/>
-            </w:pPr>
-            <w:r>
-              <w:rPr>
-                <w:rFonts w:ascii="바탕" w:cs="바탕" w:eastAsia="바탕" w:hAnsi="바탕"/>
-                <w:b w:val="false"/>
-                <w:bCs w:val="false"/>
-                <w:color w:val="0000FF"/>
-                <w:sz w:val="24"/>
-                <w:szCs w:val="24"/>
-              </w:rPr>
-              <w:t xml:space="preserve">(신랑) 오늘 반지는 아주 특별한 친구가 저희에게 전해주기로 했습니다.</w:t>
+              <w:t xml:space="preserve">(신부) 이어서 반지를 서로 교환하는 순서입니다.</w:t>
+            </w:r>
+          </w:p>
+          <w:p>
+            <w:pPr>
+              <w:spacing w:line="360"/>
+            </w:pPr>
+            <w:r>
+              <w:rPr>
+                <w:rFonts w:ascii="바탕" w:cs="바탕" w:eastAsia="바탕" w:hAnsi="바탕"/>
+                <w:b w:val="false"/>
+                <w:bCs w:val="false"/>
+                <w:color w:val="0000FF"/>
+                <w:sz w:val="24"/>
+                <w:szCs w:val="24"/>
+              </w:rPr>
+              <w:t xml:space="preserve">(신랑) 오늘 반지는 신부측 조카, 문나윤 양이 전달해 주기로 했습니다.</w:t>
             </w:r>
           </w:p>
           <w:p>
@@ -1252,23 +1172,7 @@
                 <w:sz w:val="24"/>
                 <w:szCs w:val="24"/>
               </w:rPr>
-              <w:t xml:space="preserve">(신부) 신부측 조카, 문나윤 양이 반지를 들고 입장하겠습니다.</w:t>
-            </w:r>
-          </w:p>
-          <w:p>
-            <w:pPr>
-              <w:spacing w:line="360"/>
-            </w:pPr>
-            <w:r>
-              <w:rPr>
-                <w:rFonts w:ascii="바탕" w:cs="바탕" w:eastAsia="바탕" w:hAnsi="바탕"/>
-                <w:b w:val="false"/>
-                <w:bCs w:val="false"/>
-                <w:color w:val="0000FF"/>
-                <w:sz w:val="24"/>
-                <w:szCs w:val="24"/>
-              </w:rPr>
-              <w:t xml:space="preserve">(신랑) 귀여운 화동에게 큰 박수와 환호 부탁드립니다!</w:t>
+              <w:t xml:space="preserve">(신부) 나윤이는 올해 여덟 살입니다. 큰 박수로 맞이해 주세요.</w:t>
             </w:r>
           </w:p>
           <w:p>
@@ -1314,7 +1218,7 @@
                 <w:sz w:val="24"/>
                 <w:szCs w:val="24"/>
               </w:rPr>
-              <w:t xml:space="preserve">(* 화동 문나윤 양 입장 - 신랑 신부에게 반지 전달)</w:t>
+              <w:t xml:space="preserve">(* 화동 입장 후 신랑 신부에게 반지 전달)</w:t>
             </w:r>
           </w:p>
           <w:p>
@@ -1345,7 +1249,7 @@
                 <w:sz w:val="24"/>
                 <w:szCs w:val="24"/>
               </w:rPr>
-              <w:t xml:space="preserve">(신랑) 나윤아, 반지 전해줘서 고마워~</w:t>
+              <w:t xml:space="preserve">(신랑) 나윤아, 고마워.</w:t>
             </w:r>
           </w:p>
           <w:p>
@@ -1361,7 +1265,7 @@
                 <w:sz w:val="24"/>
                 <w:szCs w:val="24"/>
               </w:rPr>
-              <w:t xml:space="preserve">(신부) 나윤이가 전해준 이 반지, 서로의 손에 끼워주겠습니다.</w:t>
+              <w:t xml:space="preserve">(신부) 나윤이가 전해준 반지를 서로에게 끼워주겠습니다.</w:t>
             </w:r>
           </w:p>
           <w:p>
@@ -1468,7 +1372,7 @@
                 <w:sz w:val="24"/>
                 <w:szCs w:val="24"/>
               </w:rPr>
-              <w:t xml:space="preserve">(신랑) 반지가 끊어짐 없는 완벽한 원을 그리듯이,</w:t>
+              <w:t xml:space="preserve">(신랑) 오늘의 약속을 잊지 않고 살겠습니다.</w:t>
             </w:r>
           </w:p>
           <w:p>
@@ -1484,7 +1388,7 @@
                 <w:sz w:val="24"/>
                 <w:szCs w:val="24"/>
               </w:rPr>
-              <w:t xml:space="preserve">(신부) 오늘 저희 두 사람의 사랑도 영원히 이어지기를 소망합니다.</w:t>
+              <w:t xml:space="preserve">(신부) 지켜봐 주셔서 감사합니다.</w:t>
             </w:r>
           </w:p>
           <w:p>
@@ -1515,23 +1419,7 @@
                 <w:sz w:val="24"/>
                 <w:szCs w:val="24"/>
               </w:rPr>
-              <w:t xml:space="preserve">(신부) 반지를 전해준 화동 문나윤 양에게도 큰 박수 부탁드립니다.</w:t>
-            </w:r>
-          </w:p>
-          <w:p>
-            <w:pPr>
-              <w:spacing w:line="360"/>
-            </w:pPr>
-            <w:r>
-              <w:rPr>
-                <w:rFonts w:ascii="바탕" w:cs="바탕" w:eastAsia="바탕" w:hAnsi="바탕"/>
-                <w:b w:val="false"/>
-                <w:bCs w:val="false"/>
-                <w:color w:val="7030A0"/>
-                <w:sz w:val="24"/>
-                <w:szCs w:val="24"/>
-              </w:rPr>
-              <w:t xml:space="preserve">(신부) 다시 한번 큰 박수 부탁드립니다.</w:t>
+              <w:t xml:space="preserve">(신부) 반지를 전해준 나윤이와 저희 두 사람에게 큰 박수 부탁드립니다.</w:t>
             </w:r>
           </w:p>
           <w:p>
@@ -1631,7 +1519,7 @@
                 <w:sz w:val="24"/>
                 <w:szCs w:val="24"/>
               </w:rPr>
-              <w:t xml:space="preserve"> (신부) 그럼 이번엔 부모님의 은혜에 앞으로 평생 보답하겠다는 의미로</w:t>
+              <w:t xml:space="preserve"> (신부) 이번에는 양가 부모님께 인사를 드리겠습니다.</w:t>
             </w:r>
           </w:p>
           <w:p>
@@ -1647,39 +1535,23 @@
                 <w:sz w:val="24"/>
                 <w:szCs w:val="24"/>
               </w:rPr>
-              <w:t xml:space="preserve"> 양가 부모님께 ‘키워주셔서 감사하고 앞으로 잘 살겠다’는 의미로</w:t>
-            </w:r>
-          </w:p>
-          <w:p>
-            <w:pPr>
-              <w:spacing w:line="360"/>
-            </w:pPr>
-            <w:r>
-              <w:rPr>
-                <w:rFonts w:ascii="바탕" w:cs="바탕" w:eastAsia="바탕" w:hAnsi="바탕"/>
-                <w:b w:val="false"/>
-                <w:bCs w:val="false"/>
-                <w:color w:val="7030A0"/>
-                <w:sz w:val="24"/>
-                <w:szCs w:val="24"/>
-              </w:rPr>
-              <w:t xml:space="preserve"> 인사를 드리도록 하겠습니다.</w:t>
-            </w:r>
-          </w:p>
-          <w:p>
-            <w:pPr>
-              <w:spacing w:line="360"/>
-            </w:pPr>
-            <w:r>
-              <w:rPr>
-                <w:rFonts w:ascii="바탕" w:cs="바탕" w:eastAsia="바탕" w:hAnsi="바탕"/>
-                <w:b w:val="false"/>
-                <w:bCs w:val="false"/>
-                <w:color w:val="0000FF"/>
-                <w:sz w:val="24"/>
-                <w:szCs w:val="24"/>
-              </w:rPr>
-              <w:t xml:space="preserve"> (신랑) 순서는 신부측 먼저 인사드리도록 하겠습니다.</w:t>
+              <w:t xml:space="preserve"> 키워주셔서 감사하고 앞으로 잘 살겠다는 마음을 전하겠습니다.</w:t>
+            </w:r>
+          </w:p>
+          <w:p>
+            <w:pPr>
+              <w:spacing w:line="360"/>
+            </w:pPr>
+            <w:r>
+              <w:rPr>
+                <w:rFonts w:ascii="바탕" w:cs="바탕" w:eastAsia="바탕" w:hAnsi="바탕"/>
+                <w:b w:val="false"/>
+                <w:bCs w:val="false"/>
+                <w:color w:val="0000FF"/>
+                <w:sz w:val="24"/>
+                <w:szCs w:val="24"/>
+              </w:rPr>
+              <w:t xml:space="preserve"> (신랑) 신부측 먼저 인사드리겠습니다.</w:t>
             </w:r>
           </w:p>
           <w:p>
@@ -1771,23 +1643,23 @@
                 <w:sz w:val="24"/>
                 <w:szCs w:val="24"/>
               </w:rPr>
-              <w:t xml:space="preserve"> (신랑) 마지막으로 오늘 저희의 결혼을 축하하기 위해</w:t>
-            </w:r>
-          </w:p>
-          <w:p>
-            <w:pPr>
-              <w:spacing w:line="360"/>
-            </w:pPr>
-            <w:r>
-              <w:rPr>
-                <w:rFonts w:ascii="바탕" w:cs="바탕" w:eastAsia="바탕" w:hAnsi="바탕"/>
-                <w:b w:val="false"/>
-                <w:bCs w:val="false"/>
-                <w:color w:val="0000FF"/>
-                <w:sz w:val="24"/>
-                <w:szCs w:val="24"/>
-              </w:rPr>
-              <w:t xml:space="preserve"> 이 자리를 빛내주신 가족 여러분께 감사 인사를 드리겠습니다.</w:t>
+              <w:t xml:space="preserve"> (신랑) 마지막으로 오늘 결혼식에 와주신</w:t>
+            </w:r>
+          </w:p>
+          <w:p>
+            <w:pPr>
+              <w:spacing w:line="360"/>
+            </w:pPr>
+            <w:r>
+              <w:rPr>
+                <w:rFonts w:ascii="바탕" w:cs="바탕" w:eastAsia="바탕" w:hAnsi="바탕"/>
+                <w:b w:val="false"/>
+                <w:bCs w:val="false"/>
+                <w:color w:val="0000FF"/>
+                <w:sz w:val="24"/>
+                <w:szCs w:val="24"/>
+              </w:rPr>
+              <w:t xml:space="preserve"> 가족 여러분께 감사 인사를 드리겠습니다.</w:t>
             </w:r>
           </w:p>
           <w:p>
@@ -1869,23 +1741,7 @@
                 <w:sz w:val="24"/>
                 <w:szCs w:val="24"/>
               </w:rPr>
-              <w:t xml:space="preserve">행진</w:t>
-            </w:r>
-          </w:p>
-          <w:p>
-            <w:pPr>
-              <w:spacing w:line="360"/>
-              <w:jc w:val="center"/>
-            </w:pPr>
-            <w:r>
-              <w:rPr>
-                <w:rFonts w:ascii="바탕" w:cs="바탕" w:eastAsia="바탕" w:hAnsi="바탕"/>
-                <w:b/>
-                <w:bCs/>
-                <w:sz w:val="24"/>
-                <w:szCs w:val="24"/>
-              </w:rPr>
-              <w:t xml:space="preserve">(신랑,신부)</w:t>
+              <w:t xml:space="preserve">축가</w:t>
             </w:r>
           </w:p>
         </w:tc>
@@ -1914,6 +1770,215 @@
                 <w:rFonts w:ascii="바탕" w:cs="바탕" w:eastAsia="바탕" w:hAnsi="바탕"/>
                 <w:b w:val="false"/>
                 <w:bCs w:val="false"/>
+                <w:color w:val="7030A0"/>
+                <w:sz w:val="24"/>
+                <w:szCs w:val="24"/>
+              </w:rPr>
+              <w:t xml:space="preserve">(신부) 이어서 축가 순서입니다.</w:t>
+            </w:r>
+          </w:p>
+          <w:p>
+            <w:pPr>
+              <w:spacing w:line="360"/>
+            </w:pPr>
+            <w:r>
+              <w:rPr>
+                <w:rFonts w:ascii="바탕" w:cs="바탕" w:eastAsia="바탕" w:hAnsi="바탕"/>
+                <w:b w:val="false"/>
+                <w:bCs w:val="false"/>
+                <w:color w:val="7030A0"/>
+                <w:sz w:val="24"/>
+                <w:szCs w:val="24"/>
+              </w:rPr>
+              <w:t xml:space="preserve">신랑이 직접 노래를 준비했습니다. 큰 박수 부탁드립니다.</w:t>
+            </w:r>
+          </w:p>
+          <w:p>
+            <w:pPr>
+              <w:spacing w:line="360"/>
+            </w:pPr>
+            <w:r>
+              <w:rPr>
+                <w:rFonts w:ascii="바탕" w:cs="바탕" w:eastAsia="바탕" w:hAnsi="바탕"/>
+                <w:b w:val="false"/>
+                <w:bCs w:val="false"/>
+                <w:sz w:val="24"/>
+                <w:szCs w:val="24"/>
+              </w:rPr>
+              <w:t xml:space="preserve"/>
+            </w:r>
+          </w:p>
+          <w:p>
+            <w:pPr>
+              <w:spacing w:line="360"/>
+            </w:pPr>
+            <w:r>
+              <w:rPr>
+                <w:rFonts w:ascii="바탕" w:cs="바탕" w:eastAsia="바탕" w:hAnsi="바탕"/>
+                <w:b w:val="false"/>
+                <w:bCs w:val="false"/>
+                <w:sz w:val="24"/>
+                <w:szCs w:val="24"/>
+              </w:rPr>
+              <w:t xml:space="preserve">(* 신랑 마이크 준비 확인 후)</w:t>
+            </w:r>
+          </w:p>
+          <w:p>
+            <w:pPr>
+              <w:spacing w:line="360"/>
+            </w:pPr>
+            <w:r>
+              <w:rPr>
+                <w:rFonts w:ascii="바탕" w:cs="바탕" w:eastAsia="바탕" w:hAnsi="바탕"/>
+                <w:b w:val="false"/>
+                <w:bCs w:val="false"/>
+                <w:color w:val="FF0000"/>
+                <w:sz w:val="24"/>
+                <w:szCs w:val="24"/>
+              </w:rPr>
+              <w:t xml:space="preserve">-축가 MR 시작 (곡명 미정)</w:t>
+            </w:r>
+          </w:p>
+          <w:p>
+            <w:pPr>
+              <w:spacing w:line="360"/>
+            </w:pPr>
+            <w:r>
+              <w:rPr>
+                <w:rFonts w:ascii="바탕" w:cs="바탕" w:eastAsia="바탕" w:hAnsi="바탕"/>
+                <w:b/>
+                <w:bCs/>
+                <w:sz w:val="24"/>
+                <w:szCs w:val="24"/>
+              </w:rPr>
+              <w:t xml:space="preserve">(신랑 축가)</w:t>
+            </w:r>
+          </w:p>
+          <w:p>
+            <w:pPr>
+              <w:spacing w:line="360"/>
+            </w:pPr>
+            <w:r>
+              <w:rPr>
+                <w:rFonts w:ascii="바탕" w:cs="바탕" w:eastAsia="바탕" w:hAnsi="바탕"/>
+                <w:b w:val="false"/>
+                <w:bCs w:val="false"/>
+                <w:color w:val="FF0000"/>
+                <w:sz w:val="24"/>
+                <w:szCs w:val="24"/>
+              </w:rPr>
+              <w:t xml:space="preserve">-축가 MR 끝</w:t>
+            </w:r>
+          </w:p>
+          <w:p>
+            <w:pPr>
+              <w:spacing w:line="360"/>
+            </w:pPr>
+            <w:r>
+              <w:rPr>
+                <w:rFonts w:ascii="바탕" w:cs="바탕" w:eastAsia="바탕" w:hAnsi="바탕"/>
+                <w:b w:val="false"/>
+                <w:bCs w:val="false"/>
+                <w:sz w:val="24"/>
+                <w:szCs w:val="24"/>
+              </w:rPr>
+              <w:t xml:space="preserve"/>
+            </w:r>
+          </w:p>
+          <w:p>
+            <w:pPr>
+              <w:spacing w:line="360"/>
+            </w:pPr>
+            <w:r>
+              <w:rPr>
+                <w:rFonts w:ascii="바탕" w:cs="바탕" w:eastAsia="바탕" w:hAnsi="바탕"/>
+                <w:b w:val="false"/>
+                <w:bCs w:val="false"/>
+                <w:color w:val="0000FF"/>
+                <w:sz w:val="24"/>
+                <w:szCs w:val="24"/>
+              </w:rPr>
+              <w:t xml:space="preserve">(신랑) 들어주셔서 감사합니다.</w:t>
+            </w:r>
+          </w:p>
+        </w:tc>
+      </w:tr>
+      <w:tr>
+        <w:tc>
+          <w:tcPr>
+            <w:tcW w:type="dxa" w:w="2400"/>
+            <w:tcBorders>
+              <w:top w:val="single" w:color="000000" w:sz="6"/>
+              <w:left w:val="single" w:color="000000" w:sz="6"/>
+              <w:bottom w:val="single" w:color="000000" w:sz="6"/>
+              <w:right w:val="single" w:color="000000" w:sz="6"/>
+            </w:tcBorders>
+            <w:tcMar>
+              <w:top w:type="dxa" w:w="80"/>
+              <w:left w:type="dxa" w:w="120"/>
+              <w:bottom w:type="dxa" w:w="80"/>
+              <w:right w:type="dxa" w:w="120"/>
+            </w:tcMar>
+            <w:vAlign w:val="center"/>
+          </w:tcPr>
+          <w:p>
+            <w:pPr>
+              <w:spacing w:line="360"/>
+              <w:jc w:val="center"/>
+            </w:pPr>
+            <w:r>
+              <w:rPr>
+                <w:rFonts w:ascii="바탕" w:cs="바탕" w:eastAsia="바탕" w:hAnsi="바탕"/>
+                <w:b/>
+                <w:bCs/>
+                <w:sz w:val="24"/>
+                <w:szCs w:val="24"/>
+              </w:rPr>
+              <w:t xml:space="preserve">행진</w:t>
+            </w:r>
+          </w:p>
+          <w:p>
+            <w:pPr>
+              <w:spacing w:line="360"/>
+              <w:jc w:val="center"/>
+            </w:pPr>
+            <w:r>
+              <w:rPr>
+                <w:rFonts w:ascii="바탕" w:cs="바탕" w:eastAsia="바탕" w:hAnsi="바탕"/>
+                <w:b/>
+                <w:bCs/>
+                <w:sz w:val="24"/>
+                <w:szCs w:val="24"/>
+              </w:rPr>
+              <w:t xml:space="preserve">(신랑,신부)</w:t>
+            </w:r>
+          </w:p>
+        </w:tc>
+        <w:tc>
+          <w:tcPr>
+            <w:tcW w:type="dxa" w:w="7000"/>
+            <w:tcBorders>
+              <w:top w:val="single" w:color="000000" w:sz="6"/>
+              <w:left w:val="single" w:color="000000" w:sz="6"/>
+              <w:bottom w:val="single" w:color="000000" w:sz="6"/>
+              <w:right w:val="single" w:color="000000" w:sz="6"/>
+            </w:tcBorders>
+            <w:tcMar>
+              <w:top w:type="dxa" w:w="80"/>
+              <w:left w:type="dxa" w:w="120"/>
+              <w:bottom w:type="dxa" w:w="80"/>
+              <w:right w:type="dxa" w:w="120"/>
+            </w:tcMar>
+          </w:tcPr>
+          <w:p>
+            <w:pPr>
+              <w:spacing w:line="360"/>
+            </w:pPr>
+            <w:r>
+              <w:rPr>
+                <w:rFonts w:ascii="바탕" w:cs="바탕" w:eastAsia="바탕" w:hAnsi="바탕"/>
+                <w:b w:val="false"/>
+                <w:bCs w:val="false"/>
                 <w:sz w:val="24"/>
                 <w:szCs w:val="24"/>
               </w:rPr>
@@ -1933,7 +1998,7 @@
                 <w:sz w:val="24"/>
                 <w:szCs w:val="24"/>
               </w:rPr>
-              <w:t xml:space="preserve"> (신부) 드디어 마지막 순서만 남았습니다.</w:t>
+              <w:t xml:space="preserve"> (신부) 이제 마지막 순서만 남았습니다.</w:t>
             </w:r>
           </w:p>
           <w:p>
@@ -1949,55 +2014,23 @@
                 <w:sz w:val="24"/>
                 <w:szCs w:val="24"/>
               </w:rPr>
-              <w:t xml:space="preserve">자리해 주신 여러분들의 축복 속에서 저희 부부가 함께</w:t>
-            </w:r>
-          </w:p>
-          <w:p>
-            <w:pPr>
-              <w:spacing w:line="360"/>
-            </w:pPr>
-            <w:r>
-              <w:rPr>
-                <w:rFonts w:ascii="바탕" w:cs="바탕" w:eastAsia="바탕" w:hAnsi="바탕"/>
-                <w:b w:val="false"/>
-                <w:bCs w:val="false"/>
-                <w:color w:val="7030A0"/>
-                <w:sz w:val="24"/>
-                <w:szCs w:val="24"/>
-              </w:rPr>
-              <w:t xml:space="preserve">행복한 미래를 꿈꾸며 내딛을 씩씩한 행진으로 마무리 하도록 하겠습니다.</w:t>
-            </w:r>
-          </w:p>
-          <w:p>
-            <w:pPr>
-              <w:spacing w:line="360"/>
-            </w:pPr>
-            <w:r>
-              <w:rPr>
-                <w:rFonts w:ascii="바탕" w:cs="바탕" w:eastAsia="바탕" w:hAnsi="바탕"/>
-                <w:b w:val="false"/>
-                <w:bCs w:val="false"/>
-                <w:color w:val="0000FF"/>
-                <w:sz w:val="24"/>
-                <w:szCs w:val="24"/>
-              </w:rPr>
-              <w:t xml:space="preserve">(신랑) ‘둘’이었던 저희 두 사람이 드디어 ‘하나’가 되었습니다.</w:t>
-            </w:r>
-          </w:p>
-          <w:p>
-            <w:pPr>
-              <w:spacing w:line="360"/>
-            </w:pPr>
-            <w:r>
-              <w:rPr>
-                <w:rFonts w:ascii="바탕" w:cs="바탕" w:eastAsia="바탕" w:hAnsi="바탕"/>
-                <w:b w:val="false"/>
-                <w:bCs w:val="false"/>
-                <w:color w:val="0000FF"/>
-                <w:sz w:val="24"/>
-                <w:szCs w:val="24"/>
-              </w:rPr>
-              <w:t xml:space="preserve">저희 앞날을 향해 힘찬 첫 발걸음을 내딛겠습니다~!</w:t>
+              <w:t xml:space="preserve">행진으로 결혼식을 마무리하겠습니다.</w:t>
+            </w:r>
+          </w:p>
+          <w:p>
+            <w:pPr>
+              <w:spacing w:line="360"/>
+            </w:pPr>
+            <w:r>
+              <w:rPr>
+                <w:rFonts w:ascii="바탕" w:cs="바탕" w:eastAsia="바탕" w:hAnsi="바탕"/>
+                <w:b w:val="false"/>
+                <w:bCs w:val="false"/>
+                <w:color w:val="0000FF"/>
+                <w:sz w:val="24"/>
+                <w:szCs w:val="24"/>
+              </w:rPr>
+              <w:t xml:space="preserve">(신랑) 오늘 와주셔서 감사합니다. 앞으로 잘 살겠습니다.</w:t>
             </w:r>
           </w:p>
           <w:p>
@@ -2042,7 +2075,7 @@
                 <w:sz w:val="24"/>
                 <w:szCs w:val="24"/>
               </w:rPr>
-              <w:t xml:space="preserve">따뜻한 격려와 뜨거운 축복의 박수로 함께 응원해주시면 감사하겠습니다.</w:t>
+              <w:t xml:space="preserve">박수로 함께 응원해주시면 감사하겠습니다.</w:t>
             </w:r>
           </w:p>
           <w:p>

</xml_diff>